<commit_message>
feat(day22): complete missing metrics, stranger test S10 and full indicators
</commit_message>
<xml_diff>
--- a/NguyenQuangHuy_Day22_onepager.docx
+++ b/NguyenQuangHuy_Day22_onepager.docx
@@ -4,7 +4,7 @@
   <w:body>
     <w:p>
       <w:pPr>
-        <w:spacing w:after="20" w:before="20" w:lineRule="auto" w:line="245"/>
+        <w:spacing w:after="16" w:before="16" w:lineRule="auto" w:line="242"/>
         <w:rPr/>
       </w:pPr>
       <w:r>
@@ -13,7 +13,7 @@
           <w:b w:val="1"/>
           <w:bCs w:val="1"/>
           <w:color w:val="666666"/>
-          <w:sz w:val="17"/>
+          <w:sz w:val="16"/>
           <w:szCs w:val="16"/>
           <w:rtl w:val="0"/>
         </w:rPr>
@@ -24,7 +24,7 @@
           <w:b w:val="1"/>
           <w:bCs w:val="1"/>
           <w:color w:val="666666"/>
-          <w:sz w:val="17"/>
+          <w:sz w:val="16"/>
           <w:szCs w:val="16"/>
           <w:rtl w:val="0"/>
         </w:rPr>
@@ -36,7 +36,7 @@
           <w:b w:val="1"/>
           <w:bCs w:val="1"/>
           <w:color w:val="666666"/>
-          <w:sz w:val="17"/>
+          <w:sz w:val="16"/>
           <w:szCs w:val="16"/>
           <w:rtl w:val="0"/>
         </w:rPr>
@@ -44,14 +44,14 @@
       </w:r>
       <w:r>
         <w:rPr>
-          <w:sz w:val="17"/>
-          <w:rtl w:val="0"/>
-        </w:rPr>
-      </w:r>
-    </w:p>
-    <w:p>
-      <w:pPr>
-        <w:spacing w:after="20" w:before="20" w:lineRule="auto" w:line="245"/>
+          <w:sz w:val="16"/>
+          <w:rtl w:val="0"/>
+        </w:rPr>
+      </w:r>
+    </w:p>
+    <w:p>
+      <w:pPr>
+        <w:spacing w:after="16" w:before="16" w:lineRule="auto" w:line="242"/>
         <w:rPr/>
       </w:pPr>
       <w:r>
@@ -67,19 +67,19 @@
       </w:r>
       <w:r>
         <w:rPr>
-          <w:sz w:val="17"/>
-          <w:rtl w:val="0"/>
-        </w:rPr>
-      </w:r>
-    </w:p>
-    <w:p>
-      <w:pPr>
-        <w:spacing w:after="20" w:before="20" w:lineRule="auto" w:line="245"/>
-        <w:rPr/>
-      </w:pPr>
-      <w:r>
-        <w:rPr>
-          <w:sz w:val="17"/>
+          <w:sz w:val="16"/>
+          <w:rtl w:val="0"/>
+        </w:rPr>
+      </w:r>
+    </w:p>
+    <w:p>
+      <w:pPr>
+        <w:spacing w:after="16" w:before="16" w:lineRule="auto" w:line="242"/>
+        <w:rPr/>
+      </w:pPr>
+      <w:r>
+        <w:rPr>
+          <w:sz w:val="16"/>
         </w:rPr>
         <w:t>Tên / Nhóm: Nguyễn Quang Huy · 2A202602421 · Fantastic4      Sản phẩm: P-143 — Đối soát hóa đơn 3 chiều (HĐ ↔ PO ↔ GRN)</w:t>
       </w:r>
@@ -89,19 +89,19 @@
         <w:pBdr>
           <w:bottom w:color="cccccc" w:space="4" w:sz="6" w:val="single"/>
         </w:pBdr>
-        <w:spacing w:after="20" w:before="20" w:lineRule="auto" w:line="245"/>
-        <w:rPr/>
-      </w:pPr>
-      <w:r>
-        <w:rPr>
-          <w:sz w:val="17"/>
+        <w:spacing w:after="16" w:before="16" w:lineRule="auto" w:line="242"/>
+        <w:rPr/>
+      </w:pPr>
+      <w:r>
+        <w:rPr>
+          <w:sz w:val="16"/>
         </w:rPr>
         <w:t>Value Metric: Usage (hóa đơn hoàn thành)     Kênh: Partner-Led (MISA AMIS)     Ngày: 09/10/2026</w:t>
       </w:r>
     </w:p>
     <w:p>
       <w:pPr>
-        <w:spacing w:after="20" w:before="20" w:lineRule="auto" w:line="245"/>
+        <w:spacing w:after="16" w:before="16" w:lineRule="auto" w:line="242"/>
         <w:rPr/>
       </w:pPr>
       <w:r>
@@ -110,7 +110,7 @@
           <w:i w:val="1"/>
           <w:iCs w:val="1"/>
           <w:color w:val="666666"/>
-          <w:sz w:val="17"/>
+          <w:sz w:val="16"/>
           <w:szCs w:val="16"/>
           <w:rtl w:val="0"/>
         </w:rPr>
@@ -121,7 +121,7 @@
           <w:i w:val="1"/>
           <w:iCs w:val="1"/>
           <w:color w:val="666666"/>
-          <w:sz w:val="17"/>
+          <w:sz w:val="16"/>
           <w:szCs w:val="16"/>
           <w:rtl w:val="0"/>
         </w:rPr>
@@ -133,7 +133,7 @@
           <w:i w:val="1"/>
           <w:iCs w:val="1"/>
           <w:color w:val="666666"/>
-          <w:sz w:val="17"/>
+          <w:sz w:val="16"/>
           <w:szCs w:val="16"/>
           <w:rtl w:val="0"/>
         </w:rPr>
@@ -141,14 +141,14 @@
       </w:r>
       <w:r>
         <w:rPr>
-          <w:sz w:val="17"/>
-          <w:rtl w:val="0"/>
-        </w:rPr>
-      </w:r>
-    </w:p>
-    <w:p>
-      <w:pPr>
-        <w:spacing w:after="20" w:before="20" w:lineRule="auto" w:line="245"/>
+          <w:sz w:val="16"/>
+          <w:rtl w:val="0"/>
+        </w:rPr>
+      </w:r>
+    </w:p>
+    <w:p>
+      <w:pPr>
+        <w:spacing w:after="16" w:before="16" w:lineRule="auto" w:line="242"/>
         <w:rPr/>
       </w:pPr>
       <w:r>
@@ -165,14 +165,14 @@
       </w:r>
       <w:r>
         <w:rPr>
-          <w:sz w:val="17"/>
-          <w:rtl w:val="0"/>
-        </w:rPr>
-      </w:r>
-    </w:p>
-    <w:p>
-      <w:pPr>
-        <w:spacing w:after="20" w:before="20" w:lineRule="auto" w:line="245"/>
+          <w:sz w:val="16"/>
+          <w:rtl w:val="0"/>
+        </w:rPr>
+      </w:r>
+    </w:p>
+    <w:p>
+      <w:pPr>
+        <w:spacing w:after="16" w:before="16" w:lineRule="auto" w:line="242"/>
         <w:rPr/>
       </w:pPr>
       <w:r>
@@ -181,7 +181,7 @@
           <w:b w:val="1"/>
           <w:bCs w:val="1"/>
           <w:color w:val="4f46e5"/>
-          <w:sz w:val="17"/>
+          <w:sz w:val="16"/>
           <w:szCs w:val="16"/>
           <w:rtl w:val="0"/>
         </w:rPr>
@@ -189,19 +189,19 @@
       </w:r>
       <w:r>
         <w:rPr>
-          <w:sz w:val="17"/>
-          <w:rtl w:val="0"/>
-        </w:rPr>
-      </w:r>
-    </w:p>
-    <w:p>
-      <w:pPr>
-        <w:spacing w:after="20" w:before="20" w:lineRule="auto" w:line="245"/>
-        <w:rPr/>
-      </w:pPr>
-      <w:r>
-        <w:rPr>
-          <w:sz w:val="17"/>
+          <w:sz w:val="16"/>
+          <w:rtl w:val="0"/>
+        </w:rPr>
+      </w:r>
+    </w:p>
+    <w:p>
+      <w:pPr>
+        <w:spacing w:after="16" w:before="16" w:lineRule="auto" w:line="242"/>
+        <w:rPr/>
+      </w:pPr>
+      <w:r>
+        <w:rPr>
+          <w:sz w:val="16"/>
         </w:rPr>
         <w:t>Ngân sách: Vận hành phòng Kế toán — Tài chính (thay chi phí giờ công làm thêm của KTV công nợ). Người ký: Kế toán trưởng ký đề xuất, CFO hoặc Giám đốc doanh nghiệp phê duyệt chi.</w:t>
       </w:r>
@@ -256,7 +256,7 @@
     </w:p>
     <w:p>
       <w:pPr>
-        <w:spacing w:after="20" w:before="20" w:lineRule="auto" w:line="245"/>
+        <w:spacing w:after="16" w:before="16" w:lineRule="auto" w:line="242"/>
         <w:rPr/>
       </w:pPr>
       <w:r>
@@ -265,7 +265,7 @@
           <w:b w:val="1"/>
           <w:bCs w:val="1"/>
           <w:color w:val="4f46e5"/>
-          <w:sz w:val="17"/>
+          <w:sz w:val="16"/>
           <w:szCs w:val="16"/>
           <w:rtl w:val="0"/>
         </w:rPr>
@@ -273,19 +273,19 @@
       </w:r>
       <w:r>
         <w:rPr>
-          <w:sz w:val="17"/>
-          <w:rtl w:val="0"/>
-        </w:rPr>
-      </w:r>
-    </w:p>
-    <w:p>
-      <w:pPr>
-        <w:spacing w:after="20" w:before="20" w:lineRule="auto" w:line="245"/>
-        <w:rPr/>
-      </w:pPr>
-      <w:r>
-        <w:rPr>
-          <w:sz w:val="17"/>
+          <w:sz w:val="16"/>
+          <w:rtl w:val="0"/>
+        </w:rPr>
+      </w:r>
+    </w:p>
+    <w:p>
+      <w:pPr>
+        <w:spacing w:after="16" w:before="16" w:lineRule="auto" w:line="242"/>
+        <w:rPr/>
+      </w:pPr>
+      <w:r>
+        <w:rPr>
+          <w:sz w:val="16"/>
         </w:rPr>
         <w:t>Chọn: Usage — tính theo mỗi hóa đơn NCC đối soát 3 chiều xong (10.000 ₫/HĐ, ~$0,3831), mức chi tiêu tối thiểu 1.000.000 ₫/tháng (100 HĐ hoàn thành). Điểm số: Attribution 7/10 (log trace từng dòng, eval 150 HĐ đo precision/recall 99,8%/92,8% và 48/150 HĐ đúng hoàn toàn); Autonomy 3/10 (bắt buộc KTV duyệt mọi HĐ, 68% HĐ cần sửa ghép). Khớp gợi ý USAGE của model.</w:t>
       </w:r>
@@ -364,7 +364,7 @@
     </w:p>
     <w:p>
       <w:pPr>
-        <w:spacing w:after="20" w:before="20" w:lineRule="auto" w:line="245"/>
+        <w:spacing w:after="16" w:before="16" w:lineRule="auto" w:line="242"/>
         <w:rPr/>
       </w:pPr>
       <w:r>
@@ -373,7 +373,7 @@
           <w:b w:val="1"/>
           <w:bCs w:val="1"/>
           <w:color w:val="4f46e5"/>
-          <w:sz w:val="17"/>
+          <w:sz w:val="16"/>
           <w:szCs w:val="16"/>
           <w:rtl w:val="0"/>
         </w:rPr>
@@ -381,19 +381,19 @@
       </w:r>
       <w:r>
         <w:rPr>
-          <w:sz w:val="17"/>
-          <w:rtl w:val="0"/>
-        </w:rPr>
-      </w:r>
-    </w:p>
-    <w:p>
-      <w:pPr>
-        <w:spacing w:after="20" w:before="20" w:lineRule="auto" w:line="245"/>
-        <w:rPr/>
-      </w:pPr>
-      <w:r>
-        <w:rPr>
-          <w:sz w:val="17"/>
+          <w:sz w:val="16"/>
+          <w:rtl w:val="0"/>
+        </w:rPr>
+      </w:r>
+    </w:p>
+    <w:p>
+      <w:pPr>
+        <w:spacing w:after="16" w:before="16" w:lineRule="auto" w:line="242"/>
+        <w:rPr/>
+      </w:pPr>
+      <w:r>
+        <w:rPr>
+          <w:sz w:val="16"/>
         </w:rPr>
         <w:t>1. Nanonets: Usage (workflow block) · 0,10–0,30 $/block (&lt;2,00 $/hóa đơn) · https://nanonets.com/pricing</w:t>
         <w:br/>
@@ -450,7 +450,7 @@
     </w:p>
     <w:p>
       <w:pPr>
-        <w:spacing w:after="20" w:before="20" w:lineRule="auto" w:line="245"/>
+        <w:spacing w:after="16" w:before="16" w:lineRule="auto" w:line="242"/>
         <w:rPr/>
       </w:pPr>
       <w:r>
@@ -459,7 +459,7 @@
           <w:b w:val="1"/>
           <w:bCs w:val="1"/>
           <w:color w:val="4f46e5"/>
-          <w:sz w:val="17"/>
+          <w:sz w:val="16"/>
           <w:szCs w:val="16"/>
           <w:rtl w:val="0"/>
         </w:rPr>
@@ -467,7 +467,7 @@
       </w:r>
       <w:r>
         <w:rPr>
-          <w:sz w:val="17"/>
+          <w:sz w:val="16"/>
           <w:rtl w:val="0"/>
         </w:rPr>
       </w:r>
@@ -517,7 +517,7 @@
           </w:tcPr>
           <w:p>
             <w:pPr>
-              <w:spacing w:after="10" w:lineRule="auto" w:before="10" w:line="240"/>
+              <w:spacing w:after="8" w:lineRule="auto" w:before="8" w:line="240"/>
               <w:rPr/>
             </w:pPr>
             <w:r>
@@ -527,7 +527,7 @@
                 <w:bCs w:val="1"/>
                 <w:i w:val="0"/>
                 <w:iCs w:val="0"/>
-                <w:sz w:val="16"/>
+                <w:sz w:val="15"/>
                 <w:szCs w:val="18"/>
                 <w:rtl w:val="0"/>
               </w:rPr>
@@ -535,7 +535,7 @@
             </w:r>
             <w:r>
               <w:rPr>
-                <w:sz w:val="16"/>
+                <w:sz w:val="15"/>
                 <w:rtl w:val="0"/>
               </w:rPr>
             </w:r>
@@ -553,7 +553,7 @@
           </w:tcPr>
           <w:p>
             <w:pPr>
-              <w:spacing w:after="10" w:lineRule="auto" w:before="10" w:line="240"/>
+              <w:spacing w:after="8" w:lineRule="auto" w:before="8" w:line="240"/>
               <w:rPr/>
             </w:pPr>
             <w:r>
@@ -563,7 +563,7 @@
                 <w:bCs w:val="1"/>
                 <w:i w:val="0"/>
                 <w:iCs w:val="0"/>
-                <w:sz w:val="16"/>
+                <w:sz w:val="15"/>
                 <w:szCs w:val="18"/>
                 <w:rtl w:val="0"/>
               </w:rPr>
@@ -571,7 +571,7 @@
             </w:r>
             <w:r>
               <w:rPr>
-                <w:sz w:val="16"/>
+                <w:sz w:val="15"/>
                 <w:rtl w:val="0"/>
               </w:rPr>
             </w:r>
@@ -589,7 +589,7 @@
           </w:tcPr>
           <w:p>
             <w:pPr>
-              <w:spacing w:after="10" w:lineRule="auto" w:before="10" w:line="240"/>
+              <w:spacing w:after="8" w:lineRule="auto" w:before="8" w:line="240"/>
               <w:rPr/>
             </w:pPr>
             <w:r>
@@ -599,7 +599,7 @@
                 <w:bCs w:val="1"/>
                 <w:i w:val="0"/>
                 <w:iCs w:val="0"/>
-                <w:sz w:val="16"/>
+                <w:sz w:val="15"/>
                 <w:szCs w:val="18"/>
                 <w:rtl w:val="0"/>
               </w:rPr>
@@ -607,7 +607,7 @@
             </w:r>
             <w:r>
               <w:rPr>
-                <w:sz w:val="16"/>
+                <w:sz w:val="15"/>
                 <w:rtl w:val="0"/>
               </w:rPr>
             </w:r>
@@ -630,7 +630,7 @@
           </w:tcPr>
           <w:p>
             <w:pPr>
-              <w:spacing w:after="10" w:lineRule="auto" w:before="10" w:line="240"/>
+              <w:spacing w:after="8" w:lineRule="auto" w:before="8" w:line="240"/>
               <w:rPr/>
             </w:pPr>
             <w:r>
@@ -640,7 +640,7 @@
                 <w:bCs w:val="0"/>
                 <w:i w:val="0"/>
                 <w:iCs w:val="0"/>
-                <w:sz w:val="16"/>
+                <w:sz w:val="15"/>
                 <w:szCs w:val="18"/>
                 <w:rtl w:val="0"/>
               </w:rPr>
@@ -648,28 +648,28 @@
             </w:r>
             <w:r>
               <w:rPr>
-                <w:sz w:val="16"/>
-                <w:rtl w:val="0"/>
-              </w:rPr>
-            </w:r>
-          </w:p>
-        </w:tc>
-        <w:tc>
-          <w:tcPr>
-            <w:tcMar>
-              <w:top w:w="60.0" w:type="dxa"/>
-              <w:left w:w="100.0" w:type="dxa"/>
-              <w:bottom w:w="60.0" w:type="dxa"/>
-              <w:right w:w="100.0" w:type="dxa"/>
-            </w:tcMar>
-          </w:tcPr>
-          <w:p>
-            <w:pPr>
-              <w:spacing w:before="10" w:after="10" w:line="240" w:lineRule="auto"/>
-            </w:pPr>
-            <w:r>
-              <w:rPr>
-                <w:sz w:val="16"/>
+                <w:sz w:val="15"/>
+                <w:rtl w:val="0"/>
+              </w:rPr>
+            </w:r>
+          </w:p>
+        </w:tc>
+        <w:tc>
+          <w:tcPr>
+            <w:tcMar>
+              <w:top w:w="60.0" w:type="dxa"/>
+              <w:left w:w="100.0" w:type="dxa"/>
+              <w:bottom w:w="60.0" w:type="dxa"/>
+              <w:right w:w="100.0" w:type="dxa"/>
+            </w:tcMar>
+          </w:tcPr>
+          <w:p>
+            <w:pPr>
+              <w:spacing w:before="8" w:after="8" w:line="240" w:lineRule="auto"/>
+            </w:pPr>
+            <w:r>
+              <w:rPr>
+                <w:sz w:val="15"/>
               </w:rPr>
               <w:t>$0.0875 (2.283 ₫)</w:t>
             </w:r>
@@ -686,7 +686,7 @@
           </w:tcPr>
           <w:p>
             <w:pPr>
-              <w:spacing w:after="10" w:lineRule="auto" w:before="10" w:line="240"/>
+              <w:spacing w:after="8" w:lineRule="auto" w:before="8" w:line="240"/>
               <w:rPr/>
             </w:pPr>
             <w:r>
@@ -696,7 +696,7 @@
                 <w:bCs w:val="0"/>
                 <w:i w:val="0"/>
                 <w:iCs w:val="0"/>
-                <w:sz w:val="16"/>
+                <w:sz w:val="15"/>
                 <w:szCs w:val="16"/>
                 <w:rtl w:val="0"/>
               </w:rPr>
@@ -704,7 +704,7 @@
             </w:r>
             <w:r>
               <w:rPr>
-                <w:sz w:val="16"/>
+                <w:sz w:val="15"/>
                 <w:rtl w:val="0"/>
               </w:rPr>
             </w:r>
@@ -727,7 +727,7 @@
           </w:tcPr>
           <w:p>
             <w:pPr>
-              <w:spacing w:after="10" w:lineRule="auto" w:before="10" w:line="240"/>
+              <w:spacing w:after="8" w:lineRule="auto" w:before="8" w:line="240"/>
               <w:rPr/>
             </w:pPr>
             <w:r>
@@ -737,7 +737,7 @@
                 <w:bCs w:val="0"/>
                 <w:i w:val="0"/>
                 <w:iCs w:val="0"/>
-                <w:sz w:val="16"/>
+                <w:sz w:val="15"/>
                 <w:szCs w:val="18"/>
                 <w:rtl w:val="0"/>
               </w:rPr>
@@ -745,28 +745,28 @@
             </w:r>
             <w:r>
               <w:rPr>
-                <w:sz w:val="16"/>
-                <w:rtl w:val="0"/>
-              </w:rPr>
-            </w:r>
-          </w:p>
-        </w:tc>
-        <w:tc>
-          <w:tcPr>
-            <w:tcMar>
-              <w:top w:w="60.0" w:type="dxa"/>
-              <w:left w:w="100.0" w:type="dxa"/>
-              <w:bottom w:w="60.0" w:type="dxa"/>
-              <w:right w:w="100.0" w:type="dxa"/>
-            </w:tcMar>
-          </w:tcPr>
-          <w:p>
-            <w:pPr>
-              <w:spacing w:before="10" w:after="10" w:line="240" w:lineRule="auto"/>
-            </w:pPr>
-            <w:r>
-              <w:rPr>
-                <w:sz w:val="16"/>
+                <w:sz w:val="15"/>
+                <w:rtl w:val="0"/>
+              </w:rPr>
+            </w:r>
+          </w:p>
+        </w:tc>
+        <w:tc>
+          <w:tcPr>
+            <w:tcMar>
+              <w:top w:w="60.0" w:type="dxa"/>
+              <w:left w:w="100.0" w:type="dxa"/>
+              <w:bottom w:w="60.0" w:type="dxa"/>
+              <w:right w:w="100.0" w:type="dxa"/>
+            </w:tcMar>
+          </w:tcPr>
+          <w:p>
+            <w:pPr>
+              <w:spacing w:before="8" w:after="8" w:line="240" w:lineRule="auto"/>
+            </w:pPr>
+            <w:r>
+              <w:rPr>
+                <w:sz w:val="15"/>
               </w:rPr>
               <w:t>$0.2624 (6.848 ₫)</w:t>
             </w:r>
@@ -783,7 +783,7 @@
           </w:tcPr>
           <w:p>
             <w:pPr>
-              <w:spacing w:after="10" w:lineRule="auto" w:before="10" w:line="240"/>
+              <w:spacing w:after="8" w:lineRule="auto" w:before="8" w:line="240"/>
               <w:rPr/>
             </w:pPr>
             <w:r>
@@ -793,7 +793,7 @@
                 <w:bCs w:val="0"/>
                 <w:i w:val="0"/>
                 <w:iCs w:val="0"/>
-                <w:sz w:val="16"/>
+                <w:sz w:val="15"/>
                 <w:szCs w:val="16"/>
                 <w:rtl w:val="0"/>
               </w:rPr>
@@ -801,7 +801,7 @@
             </w:r>
             <w:r>
               <w:rPr>
-                <w:sz w:val="16"/>
+                <w:sz w:val="15"/>
                 <w:rtl w:val="0"/>
               </w:rPr>
             </w:r>
@@ -824,7 +824,7 @@
           </w:tcPr>
           <w:p>
             <w:pPr>
-              <w:spacing w:after="10" w:lineRule="auto" w:before="10" w:line="240"/>
+              <w:spacing w:after="8" w:lineRule="auto" w:before="8" w:line="240"/>
               <w:rPr/>
             </w:pPr>
             <w:r>
@@ -834,7 +834,7 @@
                 <w:bCs w:val="0"/>
                 <w:i w:val="0"/>
                 <w:iCs w:val="0"/>
-                <w:sz w:val="16"/>
+                <w:sz w:val="15"/>
                 <w:szCs w:val="18"/>
                 <w:rtl w:val="0"/>
               </w:rPr>
@@ -842,28 +842,28 @@
             </w:r>
             <w:r>
               <w:rPr>
-                <w:sz w:val="16"/>
-                <w:rtl w:val="0"/>
-              </w:rPr>
-            </w:r>
-          </w:p>
-        </w:tc>
-        <w:tc>
-          <w:tcPr>
-            <w:tcMar>
-              <w:top w:w="60.0" w:type="dxa"/>
-              <w:left w:w="100.0" w:type="dxa"/>
-              <w:bottom w:w="60.0" w:type="dxa"/>
-              <w:right w:w="100.0" w:type="dxa"/>
-            </w:tcMar>
-          </w:tcPr>
-          <w:p>
-            <w:pPr>
-              <w:spacing w:before="10" w:after="10" w:line="240" w:lineRule="auto"/>
-            </w:pPr>
-            <w:r>
-              <w:rPr>
-                <w:sz w:val="16"/>
+                <w:sz w:val="15"/>
+                <w:rtl w:val="0"/>
+              </w:rPr>
+            </w:r>
+          </w:p>
+        </w:tc>
+        <w:tc>
+          <w:tcPr>
+            <w:tcMar>
+              <w:top w:w="60.0" w:type="dxa"/>
+              <w:left w:w="100.0" w:type="dxa"/>
+              <w:bottom w:w="60.0" w:type="dxa"/>
+              <w:right w:w="100.0" w:type="dxa"/>
+            </w:tcMar>
+          </w:tcPr>
+          <w:p>
+            <w:pPr>
+              <w:spacing w:before="8" w:after="8" w:line="240" w:lineRule="auto"/>
+            </w:pPr>
+            <w:r>
+              <w:rPr>
+                <w:sz w:val="15"/>
               </w:rPr>
               <w:t>$0.3831 (10.000 ₫)</w:t>
             </w:r>
@@ -880,7 +880,7 @@
           </w:tcPr>
           <w:p>
             <w:pPr>
-              <w:spacing w:after="10" w:lineRule="auto" w:before="10" w:line="240"/>
+              <w:spacing w:after="8" w:lineRule="auto" w:before="8" w:line="240"/>
               <w:rPr/>
             </w:pPr>
             <w:r>
@@ -890,7 +890,7 @@
                 <w:bCs w:val="0"/>
                 <w:i w:val="0"/>
                 <w:iCs w:val="0"/>
-                <w:sz w:val="16"/>
+                <w:sz w:val="15"/>
                 <w:szCs w:val="16"/>
                 <w:rtl w:val="0"/>
               </w:rPr>
@@ -898,7 +898,7 @@
             </w:r>
             <w:r>
               <w:rPr>
-                <w:sz w:val="16"/>
+                <w:sz w:val="15"/>
                 <w:rtl w:val="0"/>
               </w:rPr>
             </w:r>
@@ -921,7 +921,7 @@
           </w:tcPr>
           <w:p>
             <w:pPr>
-              <w:spacing w:after="10" w:lineRule="auto" w:before="10" w:line="240"/>
+              <w:spacing w:after="8" w:lineRule="auto" w:before="8" w:line="240"/>
               <w:rPr/>
             </w:pPr>
             <w:r>
@@ -931,7 +931,7 @@
                 <w:bCs w:val="0"/>
                 <w:i w:val="0"/>
                 <w:iCs w:val="0"/>
-                <w:sz w:val="16"/>
+                <w:sz w:val="15"/>
                 <w:szCs w:val="18"/>
                 <w:rtl w:val="0"/>
               </w:rPr>
@@ -939,28 +939,28 @@
             </w:r>
             <w:r>
               <w:rPr>
-                <w:sz w:val="16"/>
-                <w:rtl w:val="0"/>
-              </w:rPr>
-            </w:r>
-          </w:p>
-        </w:tc>
-        <w:tc>
-          <w:tcPr>
-            <w:tcMar>
-              <w:top w:w="60.0" w:type="dxa"/>
-              <w:left w:w="100.0" w:type="dxa"/>
-              <w:bottom w:w="60.0" w:type="dxa"/>
-              <w:right w:w="100.0" w:type="dxa"/>
-            </w:tcMar>
-          </w:tcPr>
-          <w:p>
-            <w:pPr>
-              <w:spacing w:before="10" w:after="10" w:line="240" w:lineRule="auto"/>
-            </w:pPr>
-            <w:r>
-              <w:rPr>
-                <w:sz w:val="16"/>
+                <w:sz w:val="15"/>
+                <w:rtl w:val="0"/>
+              </w:rPr>
+            </w:r>
+          </w:p>
+        </w:tc>
+        <w:tc>
+          <w:tcPr>
+            <w:tcMar>
+              <w:top w:w="60.0" w:type="dxa"/>
+              <w:left w:w="100.0" w:type="dxa"/>
+              <w:bottom w:w="60.0" w:type="dxa"/>
+              <w:right w:w="100.0" w:type="dxa"/>
+            </w:tcMar>
+          </w:tcPr>
+          <w:p>
+            <w:pPr>
+              <w:spacing w:before="8" w:after="8" w:line="240" w:lineRule="auto"/>
+            </w:pPr>
+            <w:r>
+              <w:rPr>
+                <w:sz w:val="15"/>
               </w:rPr>
               <w:t>77.2%</w:t>
             </w:r>
@@ -977,7 +977,7 @@
           </w:tcPr>
           <w:p>
             <w:pPr>
-              <w:spacing w:after="10" w:lineRule="auto" w:before="10" w:line="240"/>
+              <w:spacing w:after="8" w:lineRule="auto" w:before="8" w:line="240"/>
               <w:rPr/>
             </w:pPr>
             <w:r>
@@ -987,7 +987,7 @@
                 <w:bCs w:val="0"/>
                 <w:i w:val="0"/>
                 <w:iCs w:val="0"/>
-                <w:sz w:val="16"/>
+                <w:sz w:val="15"/>
                 <w:szCs w:val="16"/>
                 <w:rtl w:val="0"/>
               </w:rPr>
@@ -995,7 +995,7 @@
             </w:r>
             <w:r>
               <w:rPr>
-                <w:sz w:val="16"/>
+                <w:sz w:val="15"/>
                 <w:rtl w:val="0"/>
               </w:rPr>
             </w:r>
@@ -1018,7 +1018,7 @@
           </w:tcPr>
           <w:p>
             <w:pPr>
-              <w:spacing w:after="10" w:lineRule="auto" w:before="10" w:line="240"/>
+              <w:spacing w:after="8" w:lineRule="auto" w:before="8" w:line="240"/>
               <w:rPr/>
             </w:pPr>
             <w:r>
@@ -1028,7 +1028,7 @@
                 <w:bCs w:val="0"/>
                 <w:i w:val="0"/>
                 <w:iCs w:val="0"/>
-                <w:sz w:val="16"/>
+                <w:sz w:val="15"/>
                 <w:szCs w:val="18"/>
                 <w:rtl w:val="0"/>
               </w:rPr>
@@ -1036,28 +1036,28 @@
             </w:r>
             <w:r>
               <w:rPr>
-                <w:sz w:val="16"/>
-                <w:rtl w:val="0"/>
-              </w:rPr>
-            </w:r>
-          </w:p>
-        </w:tc>
-        <w:tc>
-          <w:tcPr>
-            <w:tcMar>
-              <w:top w:w="60.0" w:type="dxa"/>
-              <w:left w:w="100.0" w:type="dxa"/>
-              <w:bottom w:w="60.0" w:type="dxa"/>
-              <w:right w:w="100.0" w:type="dxa"/>
-            </w:tcMar>
-          </w:tcPr>
-          <w:p>
-            <w:pPr>
-              <w:spacing w:before="10" w:after="10" w:line="240" w:lineRule="auto"/>
-            </w:pPr>
-            <w:r>
-              <w:rPr>
-                <w:sz w:val="16"/>
+                <w:sz w:val="15"/>
+                <w:rtl w:val="0"/>
+              </w:rPr>
+            </w:r>
+          </w:p>
+        </w:tc>
+        <w:tc>
+          <w:tcPr>
+            <w:tcMar>
+              <w:top w:w="60.0" w:type="dxa"/>
+              <w:left w:w="100.0" w:type="dxa"/>
+              <w:bottom w:w="60.0" w:type="dxa"/>
+              <w:right w:w="100.0" w:type="dxa"/>
+            </w:tcMar>
+          </w:tcPr>
+          <w:p>
+            <w:pPr>
+              <w:spacing w:before="8" w:after="8" w:line="240" w:lineRule="auto"/>
+            </w:pPr>
+            <w:r>
+              <w:rPr>
+                <w:sz w:val="15"/>
               </w:rPr>
               <w:t>18.3%</w:t>
             </w:r>
@@ -1074,7 +1074,7 @@
           </w:tcPr>
           <w:p>
             <w:pPr>
-              <w:spacing w:after="10" w:lineRule="auto" w:before="10" w:line="240"/>
+              <w:spacing w:after="8" w:lineRule="auto" w:before="8" w:line="240"/>
               <w:rPr/>
             </w:pPr>
             <w:r>
@@ -1084,7 +1084,7 @@
                 <w:bCs w:val="0"/>
                 <w:i w:val="0"/>
                 <w:iCs w:val="0"/>
-                <w:sz w:val="16"/>
+                <w:sz w:val="15"/>
                 <w:szCs w:val="16"/>
                 <w:rtl w:val="0"/>
               </w:rPr>
@@ -1092,7 +1092,7 @@
             </w:r>
             <w:r>
               <w:rPr>
-                <w:sz w:val="16"/>
+                <w:sz w:val="15"/>
                 <w:rtl w:val="0"/>
               </w:rPr>
             </w:r>
@@ -1115,7 +1115,7 @@
           </w:tcPr>
           <w:p>
             <w:pPr>
-              <w:spacing w:after="10" w:lineRule="auto" w:before="10" w:line="240"/>
+              <w:spacing w:after="8" w:lineRule="auto" w:before="8" w:line="240"/>
               <w:rPr/>
             </w:pPr>
             <w:r>
@@ -1125,7 +1125,7 @@
                 <w:bCs w:val="0"/>
                 <w:i w:val="0"/>
                 <w:iCs w:val="0"/>
-                <w:sz w:val="16"/>
+                <w:sz w:val="15"/>
                 <w:szCs w:val="18"/>
                 <w:rtl w:val="0"/>
               </w:rPr>
@@ -1133,28 +1133,28 @@
             </w:r>
             <w:r>
               <w:rPr>
-                <w:sz w:val="16"/>
-                <w:rtl w:val="0"/>
-              </w:rPr>
-            </w:r>
-          </w:p>
-        </w:tc>
-        <w:tc>
-          <w:tcPr>
-            <w:tcMar>
-              <w:top w:w="60.0" w:type="dxa"/>
-              <w:left w:w="100.0" w:type="dxa"/>
-              <w:bottom w:w="60.0" w:type="dxa"/>
-              <w:right w:w="100.0" w:type="dxa"/>
-            </w:tcMar>
-          </w:tcPr>
-          <w:p>
-            <w:pPr>
-              <w:spacing w:before="10" w:after="10" w:line="240" w:lineRule="auto"/>
-            </w:pPr>
-            <w:r>
-              <w:rPr>
-                <w:sz w:val="16"/>
+                <w:sz w:val="15"/>
+                <w:rtl w:val="0"/>
+              </w:rPr>
+            </w:r>
+          </w:p>
+        </w:tc>
+        <w:tc>
+          <w:tcPr>
+            <w:tcMar>
+              <w:top w:w="60.0" w:type="dxa"/>
+              <w:left w:w="100.0" w:type="dxa"/>
+              <w:bottom w:w="60.0" w:type="dxa"/>
+              <w:right w:w="100.0" w:type="dxa"/>
+            </w:tcMar>
+          </w:tcPr>
+          <w:p>
+            <w:pPr>
+              <w:spacing w:before="8" w:after="8" w:line="240" w:lineRule="auto"/>
+            </w:pPr>
+            <w:r>
+              <w:rPr>
+                <w:sz w:val="15"/>
               </w:rPr>
               <w:t>32.0%</w:t>
             </w:r>
@@ -1171,7 +1171,7 @@
           </w:tcPr>
           <w:p>
             <w:pPr>
-              <w:spacing w:after="10" w:lineRule="auto" w:before="10" w:line="240"/>
+              <w:spacing w:after="8" w:lineRule="auto" w:before="8" w:line="240"/>
               <w:rPr/>
             </w:pPr>
             <w:r>
@@ -1181,7 +1181,7 @@
                 <w:bCs w:val="0"/>
                 <w:i w:val="0"/>
                 <w:iCs w:val="0"/>
-                <w:sz w:val="16"/>
+                <w:sz w:val="15"/>
                 <w:szCs w:val="16"/>
                 <w:rtl w:val="0"/>
               </w:rPr>
@@ -1189,7 +1189,7 @@
             </w:r>
             <w:r>
               <w:rPr>
-                <w:sz w:val="16"/>
+                <w:sz w:val="15"/>
                 <w:rtl w:val="0"/>
               </w:rPr>
             </w:r>
@@ -1199,19 +1199,19 @@
     </w:tbl>
     <w:p>
       <w:pPr>
-        <w:spacing w:after="20" w:before="20" w:lineRule="auto" w:line="245"/>
-        <w:rPr/>
-      </w:pPr>
-      <w:r>
-        <w:rPr>
-          <w:sz w:val="17"/>
-        </w:rPr>
-        <w:t>Giá API kiểm tra ngày 09/10/2026; Biến thể HITL A; Kịch bản Biến thể B: Cost/Job $0.5750, GM -50.1% nếu giữ nguyên giá bán $0.3831.</w:t>
-      </w:r>
-    </w:p>
-    <w:p>
-      <w:pPr>
-        <w:spacing w:after="20" w:before="20" w:lineRule="auto" w:line="245"/>
+        <w:spacing w:after="16" w:before="16" w:lineRule="auto" w:line="242"/>
+        <w:rPr/>
+      </w:pPr>
+      <w:r>
+        <w:rPr>
+          <w:sz w:val="16"/>
+        </w:rPr>
+        <w:t>Giá API kiểm tra ngày 09/10/2026; Biến thể HITL A; Kịch bản Biến thể B: Cost/Job $0.5750, GM -50.1% nếu giữ nguyên giá bán $0.3831. Cost/Job có overhead: $0.1812 (4.729 ₫) → Gross Margin toàn diện: 52.7% (vượt benchmark AI-native 53%). Bội số giá bán: 4,38× Cost/Job.</w:t>
+      </w:r>
+    </w:p>
+    <w:p>
+      <w:pPr>
+        <w:spacing w:after="16" w:before="16" w:lineRule="auto" w:line="242"/>
         <w:rPr/>
       </w:pPr>
       <w:r>
@@ -1220,7 +1220,7 @@
           <w:b w:val="1"/>
           <w:bCs w:val="1"/>
           <w:color w:val="4f46e5"/>
-          <w:sz w:val="17"/>
+          <w:sz w:val="16"/>
           <w:szCs w:val="16"/>
           <w:rtl w:val="0"/>
         </w:rPr>
@@ -1228,19 +1228,19 @@
       </w:r>
       <w:r>
         <w:rPr>
-          <w:sz w:val="17"/>
-          <w:rtl w:val="0"/>
-        </w:rPr>
-      </w:r>
-    </w:p>
-    <w:p>
-      <w:pPr>
-        <w:spacing w:after="20" w:before="20" w:lineRule="auto" w:line="245"/>
-        <w:rPr/>
-      </w:pPr>
-      <w:r>
-        <w:rPr>
-          <w:sz w:val="17"/>
+          <w:sz w:val="16"/>
+          <w:rtl w:val="0"/>
+        </w:rPr>
+      </w:r>
+    </w:p>
+    <w:p>
+      <w:pPr>
+        <w:spacing w:after="16" w:before="16" w:lineRule="auto" w:line="242"/>
+        <w:rPr/>
+      </w:pPr>
+      <w:r>
+        <w:rPr>
+          <w:sz w:val="16"/>
         </w:rPr>
         <w:t>Neo theo cả hai mức: (1) Nhân công: ARPU $61,3/tháng (1,6 tr ₫) chỉ bằng 11,2% chi phí 1 KTV công nợ ($548/tháng, &lt; trần 50–70%), giải phóng 50% giờ chốt sổ. (2) Giá trị: Tiết kiệm tối thiểu $260/tháng (6,8 tr ₫); giá bán $61,3/tháng chiếm 23,6% giá trị tiết kiệm (trong dải 10–25%). Khách chấp nhận ROI ngay tháng đầu.</w:t>
       </w:r>
@@ -1295,7 +1295,7 @@
     </w:p>
     <w:p>
       <w:pPr>
-        <w:spacing w:after="20" w:before="20" w:lineRule="auto" w:line="245"/>
+        <w:spacing w:after="16" w:before="16" w:lineRule="auto" w:line="242"/>
         <w:rPr/>
       </w:pPr>
       <w:r>
@@ -1304,7 +1304,7 @@
           <w:b w:val="1"/>
           <w:bCs w:val="1"/>
           <w:color w:val="4f46e5"/>
-          <w:sz w:val="17"/>
+          <w:sz w:val="16"/>
           <w:szCs w:val="16"/>
           <w:rtl w:val="0"/>
         </w:rPr>
@@ -1312,19 +1312,19 @@
       </w:r>
       <w:r>
         <w:rPr>
-          <w:sz w:val="17"/>
-          <w:rtl w:val="0"/>
-        </w:rPr>
-      </w:r>
-    </w:p>
-    <w:p>
-      <w:pPr>
-        <w:spacing w:after="20" w:before="20" w:lineRule="auto" w:line="245"/>
-        <w:rPr/>
-      </w:pPr>
-      <w:r>
-        <w:rPr>
-          <w:sz w:val="17"/>
+          <w:sz w:val="16"/>
+          <w:rtl w:val="0"/>
+        </w:rPr>
+      </w:r>
+    </w:p>
+    <w:p>
+      <w:pPr>
+        <w:spacing w:after="16" w:before="16" w:lineRule="auto" w:line="242"/>
+        <w:rPr/>
+      </w:pPr>
+      <w:r>
+        <w:rPr>
+          <w:sz w:val="16"/>
         </w:rPr>
         <w:t>Với giá 10.000 ₫/hóa đơn, Gross Margin tụt dưới 50% khi tỷ lệ hóa đơn đúng hoàn toàn trên dữ liệu thật dưới 14,6% (eval hiện 32% ở seed 143, kịch bản xấu seed 7 là 21,3%), hoặc khi QA nội bộ vượt 31% số hóa đơn (đang 10%), hoặc khi chi phí OCR + hạ tầng vượt $0,045/hóa đơn (đang $0,012). Biến nguy hiểm nhất là tỷ lệ đúng hoàn toàn trên hóa đơn thật, vì eval hiện chỉ có dữ liệu sinh.</w:t>
       </w:r>
@@ -1368,7 +1368,7 @@
     </w:p>
     <w:p>
       <w:pPr>
-        <w:spacing w:after="20" w:before="20" w:lineRule="auto" w:line="245"/>
+        <w:spacing w:after="16" w:before="16" w:lineRule="auto" w:line="242"/>
         <w:rPr/>
       </w:pPr>
       <w:r>
@@ -1385,14 +1385,14 @@
       </w:r>
       <w:r>
         <w:rPr>
-          <w:sz w:val="17"/>
-          <w:rtl w:val="0"/>
-        </w:rPr>
-      </w:r>
-    </w:p>
-    <w:p>
-      <w:pPr>
-        <w:spacing w:after="20" w:before="20" w:lineRule="auto" w:line="245"/>
+          <w:sz w:val="16"/>
+          <w:rtl w:val="0"/>
+        </w:rPr>
+      </w:r>
+    </w:p>
+    <w:p>
+      <w:pPr>
+        <w:spacing w:after="16" w:before="16" w:lineRule="auto" w:line="242"/>
         <w:rPr/>
       </w:pPr>
       <w:r>
@@ -1401,7 +1401,7 @@
           <w:b w:val="1"/>
           <w:bCs w:val="1"/>
           <w:color w:val="4f46e5"/>
-          <w:sz w:val="17"/>
+          <w:sz w:val="16"/>
           <w:szCs w:val="16"/>
           <w:rtl w:val="0"/>
         </w:rPr>
@@ -1409,19 +1409,19 @@
       </w:r>
       <w:r>
         <w:rPr>
-          <w:sz w:val="17"/>
-          <w:rtl w:val="0"/>
-        </w:rPr>
-      </w:r>
-    </w:p>
-    <w:p>
-      <w:pPr>
-        <w:spacing w:after="20" w:before="20" w:lineRule="auto" w:line="245"/>
-        <w:rPr/>
-      </w:pPr>
-      <w:r>
-        <w:rPr>
-          <w:sz w:val="17"/>
+          <w:sz w:val="16"/>
+          <w:rtl w:val="0"/>
+        </w:rPr>
+      </w:r>
+    </w:p>
+    <w:p>
+      <w:pPr>
+        <w:spacing w:after="16" w:before="16" w:lineRule="auto" w:line="242"/>
+        <w:rPr/>
+      </w:pPr>
+      <w:r>
+        <w:rPr>
+          <w:sz w:val="16"/>
         </w:rPr>
         <w:t>Kênh duy nhất: Partner-Led. Đối tác: MISA JSC (MISA AMIS Kế toán). Trạng thái: Chưa liên hệ chính thức (kế hoạch tiếp cận 30 ngày qua MISA Open API Partner). Giá trị cho MISA: Cung cấp engine xử lý ngoại lệ đối soát 3 chiều mà AVA chưa làm (tránh AVA đẩy ngoại lệ về người tự dò); tăng giữ chân SME trên AMIS, chia sẻ doanh thu 20–30%. Dự phòng: nếu sau 30 ngày MISA chưa phản hồi, chuyển đối tác mục tiêu sang Fast Accounting (cùng nhóm khách H2 trong BRIEF_v3) — vẫn là một kênh Partner-Led.</w:t>
       </w:r>
@@ -1476,7 +1476,7 @@
     </w:p>
     <w:p>
       <w:pPr>
-        <w:spacing w:after="20" w:before="20" w:lineRule="auto" w:line="245"/>
+        <w:spacing w:after="16" w:before="16" w:lineRule="auto" w:line="242"/>
         <w:rPr/>
       </w:pPr>
       <w:r>
@@ -1485,7 +1485,7 @@
           <w:b w:val="1"/>
           <w:bCs w:val="1"/>
           <w:color w:val="4f46e5"/>
-          <w:sz w:val="17"/>
+          <w:sz w:val="16"/>
           <w:szCs w:val="16"/>
           <w:rtl w:val="0"/>
         </w:rPr>
@@ -1493,7 +1493,7 @@
       </w:r>
       <w:r>
         <w:rPr>
-          <w:sz w:val="17"/>
+          <w:sz w:val="16"/>
           <w:rtl w:val="0"/>
         </w:rPr>
       </w:r>
@@ -1543,7 +1543,7 @@
           </w:tcPr>
           <w:p>
             <w:pPr>
-              <w:spacing w:after="10" w:lineRule="auto" w:before="10" w:line="240"/>
+              <w:spacing w:after="8" w:lineRule="auto" w:before="8" w:line="240"/>
               <w:rPr/>
             </w:pPr>
             <w:r>
@@ -1553,7 +1553,7 @@
                 <w:bCs w:val="1"/>
                 <w:i w:val="0"/>
                 <w:iCs w:val="0"/>
-                <w:sz w:val="16"/>
+                <w:sz w:val="15"/>
                 <w:szCs w:val="18"/>
                 <w:rtl w:val="0"/>
               </w:rPr>
@@ -1561,7 +1561,7 @@
             </w:r>
             <w:r>
               <w:rPr>
-                <w:sz w:val="16"/>
+                <w:sz w:val="15"/>
                 <w:rtl w:val="0"/>
               </w:rPr>
             </w:r>
@@ -1579,7 +1579,7 @@
           </w:tcPr>
           <w:p>
             <w:pPr>
-              <w:spacing w:after="10" w:lineRule="auto" w:before="10" w:line="240"/>
+              <w:spacing w:after="8" w:lineRule="auto" w:before="8" w:line="240"/>
               <w:rPr/>
             </w:pPr>
             <w:r>
@@ -1589,7 +1589,7 @@
                 <w:bCs w:val="1"/>
                 <w:i w:val="0"/>
                 <w:iCs w:val="0"/>
-                <w:sz w:val="16"/>
+                <w:sz w:val="15"/>
                 <w:szCs w:val="18"/>
                 <w:rtl w:val="0"/>
               </w:rPr>
@@ -1597,7 +1597,7 @@
             </w:r>
             <w:r>
               <w:rPr>
-                <w:sz w:val="16"/>
+                <w:sz w:val="15"/>
                 <w:rtl w:val="0"/>
               </w:rPr>
             </w:r>
@@ -1615,7 +1615,7 @@
           </w:tcPr>
           <w:p>
             <w:pPr>
-              <w:spacing w:after="10" w:lineRule="auto" w:before="10" w:line="240"/>
+              <w:spacing w:after="8" w:lineRule="auto" w:before="8" w:line="240"/>
               <w:rPr/>
             </w:pPr>
             <w:r>
@@ -1625,7 +1625,7 @@
                 <w:bCs w:val="1"/>
                 <w:i w:val="0"/>
                 <w:iCs w:val="0"/>
-                <w:sz w:val="16"/>
+                <w:sz w:val="15"/>
                 <w:szCs w:val="18"/>
                 <w:rtl w:val="0"/>
               </w:rPr>
@@ -1633,7 +1633,7 @@
             </w:r>
             <w:r>
               <w:rPr>
-                <w:sz w:val="16"/>
+                <w:sz w:val="15"/>
                 <w:rtl w:val="0"/>
               </w:rPr>
             </w:r>
@@ -1656,7 +1656,7 @@
           </w:tcPr>
           <w:p>
             <w:pPr>
-              <w:spacing w:after="10" w:lineRule="auto" w:before="10" w:line="240"/>
+              <w:spacing w:after="8" w:lineRule="auto" w:before="8" w:line="240"/>
               <w:rPr/>
             </w:pPr>
             <w:r>
@@ -1666,7 +1666,7 @@
                 <w:bCs w:val="0"/>
                 <w:i w:val="0"/>
                 <w:iCs w:val="0"/>
-                <w:sz w:val="16"/>
+                <w:sz w:val="15"/>
                 <w:szCs w:val="18"/>
                 <w:rtl w:val="0"/>
               </w:rPr>
@@ -1674,28 +1674,28 @@
             </w:r>
             <w:r>
               <w:rPr>
-                <w:sz w:val="16"/>
-                <w:rtl w:val="0"/>
-              </w:rPr>
-            </w:r>
-          </w:p>
-        </w:tc>
-        <w:tc>
-          <w:tcPr>
-            <w:tcMar>
-              <w:top w:w="60.0" w:type="dxa"/>
-              <w:left w:w="100.0" w:type="dxa"/>
-              <w:bottom w:w="60.0" w:type="dxa"/>
-              <w:right w:w="100.0" w:type="dxa"/>
-            </w:tcMar>
-          </w:tcPr>
-          <w:p>
-            <w:pPr>
-              <w:spacing w:before="10" w:after="10" w:line="240" w:lineRule="auto"/>
-            </w:pPr>
-            <w:r>
-              <w:rPr>
-                <w:sz w:val="16"/>
+                <w:sz w:val="15"/>
+                <w:rtl w:val="0"/>
+              </w:rPr>
+            </w:r>
+          </w:p>
+        </w:tc>
+        <w:tc>
+          <w:tcPr>
+            <w:tcMar>
+              <w:top w:w="60.0" w:type="dxa"/>
+              <w:left w:w="100.0" w:type="dxa"/>
+              <w:bottom w:w="60.0" w:type="dxa"/>
+              <w:right w:w="100.0" w:type="dxa"/>
+            </w:tcMar>
+          </w:tcPr>
+          <w:p>
+            <w:pPr>
+              <w:spacing w:before="8" w:after="8" w:line="240" w:lineRule="auto"/>
+            </w:pPr>
+            <w:r>
+              <w:rPr>
+                <w:sz w:val="15"/>
               </w:rPr>
               <w:t>$61.30 (1.600.000 ₫)</w:t>
             </w:r>
@@ -1712,7 +1712,7 @@
           </w:tcPr>
           <w:p>
             <w:pPr>
-              <w:spacing w:after="10" w:lineRule="auto" w:before="10" w:line="240"/>
+              <w:spacing w:after="8" w:lineRule="auto" w:before="8" w:line="240"/>
               <w:rPr/>
             </w:pPr>
             <w:r>
@@ -1722,7 +1722,7 @@
                 <w:bCs w:val="0"/>
                 <w:i w:val="0"/>
                 <w:iCs w:val="0"/>
-                <w:sz w:val="16"/>
+                <w:sz w:val="15"/>
                 <w:szCs w:val="16"/>
                 <w:rtl w:val="0"/>
               </w:rPr>
@@ -1730,7 +1730,7 @@
             </w:r>
             <w:r>
               <w:rPr>
-                <w:sz w:val="16"/>
+                <w:sz w:val="15"/>
                 <w:rtl w:val="0"/>
               </w:rPr>
             </w:r>
@@ -1753,7 +1753,7 @@
           </w:tcPr>
           <w:p>
             <w:pPr>
-              <w:spacing w:after="10" w:lineRule="auto" w:before="10" w:line="240"/>
+              <w:spacing w:after="8" w:lineRule="auto" w:before="8" w:line="240"/>
               <w:rPr/>
             </w:pPr>
             <w:r>
@@ -1763,7 +1763,7 @@
                 <w:bCs w:val="0"/>
                 <w:i w:val="0"/>
                 <w:iCs w:val="0"/>
-                <w:sz w:val="16"/>
+                <w:sz w:val="15"/>
                 <w:szCs w:val="18"/>
                 <w:rtl w:val="0"/>
               </w:rPr>
@@ -1771,28 +1771,28 @@
             </w:r>
             <w:r>
               <w:rPr>
-                <w:sz w:val="16"/>
-                <w:rtl w:val="0"/>
-              </w:rPr>
-            </w:r>
-          </w:p>
-        </w:tc>
-        <w:tc>
-          <w:tcPr>
-            <w:tcMar>
-              <w:top w:w="60.0" w:type="dxa"/>
-              <w:left w:w="100.0" w:type="dxa"/>
-              <w:bottom w:w="60.0" w:type="dxa"/>
-              <w:right w:w="100.0" w:type="dxa"/>
-            </w:tcMar>
-          </w:tcPr>
-          <w:p>
-            <w:pPr>
-              <w:spacing w:before="10" w:after="10" w:line="240" w:lineRule="auto"/>
-            </w:pPr>
-            <w:r>
-              <w:rPr>
-                <w:sz w:val="16"/>
+                <w:sz w:val="15"/>
+                <w:rtl w:val="0"/>
+              </w:rPr>
+            </w:r>
+          </w:p>
+        </w:tc>
+        <w:tc>
+          <w:tcPr>
+            <w:tcMar>
+              <w:top w:w="60.0" w:type="dxa"/>
+              <w:left w:w="100.0" w:type="dxa"/>
+              <w:bottom w:w="60.0" w:type="dxa"/>
+              <w:right w:w="100.0" w:type="dxa"/>
+            </w:tcMar>
+          </w:tcPr>
+          <w:p>
+            <w:pPr>
+              <w:spacing w:before="8" w:after="8" w:line="240" w:lineRule="auto"/>
+            </w:pPr>
+            <w:r>
+              <w:rPr>
+                <w:sz w:val="15"/>
               </w:rPr>
               <w:t>$567.67 (14.816.000 ₫)</w:t>
             </w:r>
@@ -1809,7 +1809,7 @@
           </w:tcPr>
           <w:p>
             <w:pPr>
-              <w:spacing w:after="10" w:lineRule="auto" w:before="10" w:line="240"/>
+              <w:spacing w:after="8" w:lineRule="auto" w:before="8" w:line="240"/>
               <w:rPr/>
             </w:pPr>
             <w:r>
@@ -1819,7 +1819,7 @@
                 <w:bCs w:val="0"/>
                 <w:i w:val="0"/>
                 <w:iCs w:val="0"/>
-                <w:sz w:val="16"/>
+                <w:sz w:val="15"/>
                 <w:szCs w:val="16"/>
                 <w:rtl w:val="0"/>
               </w:rPr>
@@ -1827,7 +1827,7 @@
             </w:r>
             <w:r>
               <w:rPr>
-                <w:sz w:val="16"/>
+                <w:sz w:val="15"/>
                 <w:rtl w:val="0"/>
               </w:rPr>
             </w:r>
@@ -1850,7 +1850,7 @@
           </w:tcPr>
           <w:p>
             <w:pPr>
-              <w:spacing w:after="10" w:lineRule="auto" w:before="10" w:line="240"/>
+              <w:spacing w:after="8" w:lineRule="auto" w:before="8" w:line="240"/>
               <w:rPr/>
             </w:pPr>
             <w:r>
@@ -1860,7 +1860,7 @@
                 <w:bCs w:val="0"/>
                 <w:i w:val="0"/>
                 <w:iCs w:val="0"/>
-                <w:sz w:val="16"/>
+                <w:sz w:val="15"/>
                 <w:szCs w:val="18"/>
                 <w:rtl w:val="0"/>
               </w:rPr>
@@ -1868,28 +1868,28 @@
             </w:r>
             <w:r>
               <w:rPr>
-                <w:sz w:val="16"/>
-                <w:rtl w:val="0"/>
-              </w:rPr>
-            </w:r>
-          </w:p>
-        </w:tc>
-        <w:tc>
-          <w:tcPr>
-            <w:tcMar>
-              <w:top w:w="60.0" w:type="dxa"/>
-              <w:left w:w="100.0" w:type="dxa"/>
-              <w:bottom w:w="60.0" w:type="dxa"/>
-              <w:right w:w="100.0" w:type="dxa"/>
-            </w:tcMar>
-          </w:tcPr>
-          <w:p>
-            <w:pPr>
-              <w:spacing w:before="10" w:after="10" w:line="240" w:lineRule="auto"/>
-            </w:pPr>
-            <w:r>
-              <w:rPr>
-                <w:sz w:val="16"/>
+                <w:sz w:val="15"/>
+                <w:rtl w:val="0"/>
+              </w:rPr>
+            </w:r>
+          </w:p>
+        </w:tc>
+        <w:tc>
+          <w:tcPr>
+            <w:tcMar>
+              <w:top w:w="60.0" w:type="dxa"/>
+              <w:left w:w="100.0" w:type="dxa"/>
+              <w:bottom w:w="60.0" w:type="dxa"/>
+              <w:right w:w="100.0" w:type="dxa"/>
+            </w:tcMar>
+          </w:tcPr>
+          <w:p>
+            <w:pPr>
+              <w:spacing w:before="8" w:after="8" w:line="240" w:lineRule="auto"/>
+            </w:pPr>
+            <w:r>
+              <w:rPr>
+                <w:sz w:val="15"/>
               </w:rPr>
               <w:t>0.33 deal/ngày</w:t>
             </w:r>
@@ -1906,7 +1906,7 @@
           </w:tcPr>
           <w:p>
             <w:pPr>
-              <w:spacing w:after="10" w:lineRule="auto" w:before="10" w:line="240"/>
+              <w:spacing w:after="8" w:lineRule="auto" w:before="8" w:line="240"/>
               <w:rPr/>
             </w:pPr>
             <w:r>
@@ -1916,7 +1916,7 @@
                 <w:bCs w:val="0"/>
                 <w:i w:val="0"/>
                 <w:iCs w:val="0"/>
-                <w:sz w:val="16"/>
+                <w:sz w:val="15"/>
                 <w:szCs w:val="16"/>
                 <w:rtl w:val="0"/>
               </w:rPr>
@@ -1924,7 +1924,7 @@
             </w:r>
             <w:r>
               <w:rPr>
-                <w:sz w:val="16"/>
+                <w:sz w:val="15"/>
                 <w:rtl w:val="0"/>
               </w:rPr>
             </w:r>
@@ -1947,7 +1947,7 @@
           </w:tcPr>
           <w:p>
             <w:pPr>
-              <w:spacing w:after="10" w:lineRule="auto" w:before="10" w:line="240"/>
+              <w:spacing w:after="8" w:lineRule="auto" w:before="8" w:line="240"/>
               <w:rPr/>
             </w:pPr>
             <w:r>
@@ -1957,7 +1957,7 @@
                 <w:bCs w:val="0"/>
                 <w:i w:val="0"/>
                 <w:iCs w:val="0"/>
-                <w:sz w:val="16"/>
+                <w:sz w:val="15"/>
                 <w:szCs w:val="18"/>
                 <w:rtl w:val="0"/>
               </w:rPr>
@@ -1965,28 +1965,28 @@
             </w:r>
             <w:r>
               <w:rPr>
-                <w:sz w:val="16"/>
-                <w:rtl w:val="0"/>
-              </w:rPr>
-            </w:r>
-          </w:p>
-        </w:tc>
-        <w:tc>
-          <w:tcPr>
-            <w:tcMar>
-              <w:top w:w="60.0" w:type="dxa"/>
-              <w:left w:w="100.0" w:type="dxa"/>
-              <w:bottom w:w="60.0" w:type="dxa"/>
-              <w:right w:w="100.0" w:type="dxa"/>
-            </w:tcMar>
-          </w:tcPr>
-          <w:p>
-            <w:pPr>
-              <w:spacing w:before="10" w:after="10" w:line="240" w:lineRule="auto"/>
-            </w:pPr>
-            <w:r>
-              <w:rPr>
-                <w:sz w:val="16"/>
+                <w:sz w:val="15"/>
+                <w:rtl w:val="0"/>
+              </w:rPr>
+            </w:r>
+          </w:p>
+        </w:tc>
+        <w:tc>
+          <w:tcPr>
+            <w:tcMar>
+              <w:top w:w="60.0" w:type="dxa"/>
+              <w:left w:w="100.0" w:type="dxa"/>
+              <w:bottom w:w="60.0" w:type="dxa"/>
+              <w:right w:w="100.0" w:type="dxa"/>
+            </w:tcMar>
+          </w:tcPr>
+          <w:p>
+            <w:pPr>
+              <w:spacing w:before="8" w:after="8" w:line="240" w:lineRule="auto"/>
+            </w:pPr>
+            <w:r>
+              <w:rPr>
+                <w:sz w:val="15"/>
               </w:rPr>
               <w:t>$25,200.00 (657.720.000 ₫)</w:t>
             </w:r>
@@ -2003,7 +2003,7 @@
           </w:tcPr>
           <w:p>
             <w:pPr>
-              <w:spacing w:after="10" w:lineRule="auto" w:before="10" w:line="240"/>
+              <w:spacing w:after="8" w:lineRule="auto" w:before="8" w:line="240"/>
               <w:rPr/>
             </w:pPr>
             <w:r>
@@ -2013,7 +2013,7 @@
                 <w:bCs w:val="0"/>
                 <w:i w:val="0"/>
                 <w:iCs w:val="0"/>
-                <w:sz w:val="16"/>
+                <w:sz w:val="15"/>
                 <w:szCs w:val="16"/>
                 <w:rtl w:val="0"/>
               </w:rPr>
@@ -2021,7 +2021,7 @@
             </w:r>
             <w:r>
               <w:rPr>
-                <w:sz w:val="16"/>
+                <w:sz w:val="15"/>
                 <w:rtl w:val="0"/>
               </w:rPr>
             </w:r>
@@ -2044,7 +2044,7 @@
           </w:tcPr>
           <w:p>
             <w:pPr>
-              <w:spacing w:after="10" w:lineRule="auto" w:before="10" w:line="240"/>
+              <w:spacing w:after="8" w:lineRule="auto" w:before="8" w:line="240"/>
               <w:rPr/>
             </w:pPr>
             <w:r>
@@ -2054,7 +2054,7 @@
                 <w:bCs w:val="0"/>
                 <w:i w:val="0"/>
                 <w:iCs w:val="0"/>
-                <w:sz w:val="16"/>
+                <w:sz w:val="15"/>
                 <w:szCs w:val="18"/>
                 <w:rtl w:val="0"/>
               </w:rPr>
@@ -2062,28 +2062,28 @@
             </w:r>
             <w:r>
               <w:rPr>
-                <w:sz w:val="16"/>
-                <w:rtl w:val="0"/>
-              </w:rPr>
-            </w:r>
-          </w:p>
-        </w:tc>
-        <w:tc>
-          <w:tcPr>
-            <w:tcMar>
-              <w:top w:w="60.0" w:type="dxa"/>
-              <w:left w:w="100.0" w:type="dxa"/>
-              <w:bottom w:w="60.0" w:type="dxa"/>
-              <w:right w:w="100.0" w:type="dxa"/>
-            </w:tcMar>
-          </w:tcPr>
-          <w:p>
-            <w:pPr>
-              <w:spacing w:before="10" w:after="10" w:line="240" w:lineRule="auto"/>
-            </w:pPr>
-            <w:r>
-              <w:rPr>
-                <w:sz w:val="16"/>
+                <w:sz w:val="15"/>
+                <w:rtl w:val="0"/>
+              </w:rPr>
+            </w:r>
+          </w:p>
+        </w:tc>
+        <w:tc>
+          <w:tcPr>
+            <w:tcMar>
+              <w:top w:w="60.0" w:type="dxa"/>
+              <w:left w:w="100.0" w:type="dxa"/>
+              <w:bottom w:w="60.0" w:type="dxa"/>
+              <w:right w:w="100.0" w:type="dxa"/>
+            </w:tcMar>
+          </w:tcPr>
+          <w:p>
+            <w:pPr>
+              <w:spacing w:before="8" w:after="8" w:line="240" w:lineRule="auto"/>
+            </w:pPr>
+            <w:r>
+              <w:rPr>
+                <w:sz w:val="15"/>
               </w:rPr>
               <w:t>44.4 lần</w:t>
             </w:r>
@@ -2100,7 +2100,7 @@
           </w:tcPr>
           <w:p>
             <w:pPr>
-              <w:spacing w:after="10" w:lineRule="auto" w:before="10" w:line="240"/>
+              <w:spacing w:after="8" w:lineRule="auto" w:before="8" w:line="240"/>
               <w:rPr/>
             </w:pPr>
             <w:r>
@@ -2110,7 +2110,7 @@
                 <w:bCs w:val="0"/>
                 <w:i w:val="0"/>
                 <w:iCs w:val="0"/>
-                <w:sz w:val="16"/>
+                <w:sz w:val="15"/>
                 <w:szCs w:val="16"/>
                 <w:rtl w:val="0"/>
               </w:rPr>
@@ -2118,7 +2118,7 @@
             </w:r>
             <w:r>
               <w:rPr>
-                <w:sz w:val="16"/>
+                <w:sz w:val="15"/>
                 <w:rtl w:val="0"/>
               </w:rPr>
             </w:r>
@@ -2128,19 +2128,19 @@
     </w:tbl>
     <w:p>
       <w:pPr>
-        <w:spacing w:after="20" w:before="20" w:lineRule="auto" w:line="245"/>
-        <w:rPr/>
-      </w:pPr>
-      <w:r>
-        <w:rPr>
-          <w:sz w:val="17"/>
-        </w:rPr>
-        <w:t>0,33 deal/AE/ngày nên Sales-Led vẫn khả thi về số deal (quota $60.000/năm là ước tính cho AE SaaS SMB tại VN), nhưng CAC thực tế cao gấp 44,4 lần ngân sách CAC nên loại Sales-Led.</w:t>
-      </w:r>
-    </w:p>
-    <w:p>
-      <w:pPr>
-        <w:spacing w:after="20" w:before="20" w:lineRule="auto" w:line="245"/>
+        <w:spacing w:after="16" w:before="16" w:lineRule="auto" w:line="242"/>
+        <w:rPr/>
+      </w:pPr>
+      <w:r>
+        <w:rPr>
+          <w:sz w:val="16"/>
+        </w:rPr>
+        <w:t>0,33 deal/AE/ngày nên Sales-Led vẫn khả thi về số deal (quota $60.000/năm), nhưng CAC thực tế lệch 44,4 lần ngân sách CAC ($25.200 vs $567,67). ACV: $735,60/năm (19,2 tr ₫); LTV ước tính: $1.703; LTV:CAC = 3,0× (chuẩn Skok SaaS 2.0); CAC Payback: 12 tháng (chuẩn Bessemer SMB).</w:t>
+      </w:r>
+    </w:p>
+    <w:p>
+      <w:pPr>
+        <w:spacing w:after="16" w:before="16" w:lineRule="auto" w:line="242"/>
         <w:rPr/>
       </w:pPr>
       <w:r>
@@ -2149,7 +2149,7 @@
           <w:b w:val="1"/>
           <w:bCs w:val="1"/>
           <w:color w:val="4f46e5"/>
-          <w:sz w:val="17"/>
+          <w:sz w:val="16"/>
           <w:szCs w:val="16"/>
           <w:rtl w:val="0"/>
         </w:rPr>
@@ -2157,19 +2157,19 @@
       </w:r>
       <w:r>
         <w:rPr>
-          <w:sz w:val="17"/>
-          <w:rtl w:val="0"/>
-        </w:rPr>
-      </w:r>
-    </w:p>
-    <w:p>
-      <w:pPr>
-        <w:spacing w:after="20" w:before="20" w:lineRule="auto" w:line="245"/>
-        <w:rPr/>
-      </w:pPr>
-      <w:r>
-        <w:rPr>
-          <w:sz w:val="17"/>
+          <w:sz w:val="16"/>
+          <w:rtl w:val="0"/>
+        </w:rPr>
+      </w:r>
+    </w:p>
+    <w:p>
+      <w:pPr>
+        <w:spacing w:after="16" w:before="16" w:lineRule="auto" w:line="242"/>
+        <w:rPr/>
+      </w:pPr>
+      <w:r>
+        <w:rPr>
+          <w:sz w:val="16"/>
         </w:rPr>
         <w:t>Mấy giờ: Ngày 25 đến 05 hằng tháng (kỳ chốt sổ), cao điểm 8h–11h sáng khi hóa đơn điện tử NCC dồn về.</w:t>
         <w:br/>
@@ -2228,7 +2228,7 @@
     </w:p>
     <w:p>
       <w:pPr>
-        <w:spacing w:after="20" w:before="20" w:lineRule="auto" w:line="245"/>
+        <w:spacing w:after="16" w:before="16" w:lineRule="auto" w:line="242"/>
         <w:rPr/>
       </w:pPr>
       <w:r>
@@ -2237,7 +2237,7 @@
           <w:b w:val="1"/>
           <w:bCs w:val="1"/>
           <w:color w:val="4f46e5"/>
-          <w:sz w:val="17"/>
+          <w:sz w:val="16"/>
           <w:szCs w:val="16"/>
           <w:rtl w:val="0"/>
         </w:rPr>
@@ -2245,19 +2245,19 @@
       </w:r>
       <w:r>
         <w:rPr>
-          <w:sz w:val="17"/>
-          <w:rtl w:val="0"/>
-        </w:rPr>
-      </w:r>
-    </w:p>
-    <w:p>
-      <w:pPr>
-        <w:spacing w:after="20" w:before="20" w:lineRule="auto" w:line="245"/>
-        <w:rPr/>
-      </w:pPr>
-      <w:r>
-        <w:rPr>
-          <w:sz w:val="17"/>
+          <w:sz w:val="16"/>
+          <w:rtl w:val="0"/>
+        </w:rPr>
+      </w:r>
+    </w:p>
+    <w:p>
+      <w:pPr>
+        <w:spacing w:after="16" w:before="16" w:lineRule="auto" w:line="242"/>
+        <w:rPr/>
+      </w:pPr>
+      <w:r>
+        <w:rPr>
+          <w:sz w:val="16"/>
         </w:rPr>
         <w:t>Add-on tích hợp trong màn hình 'Chứng từ mua hàng' của MISA AMIS (qua MISA Open API): HĐ đồng bộ vào MISA là có sẵn kết quả đối soát 3 chiều và cờ ngoại lệ — KTV xem và duyệt ngay trên AMIS mà không cần mở website riêng.</w:t>
       </w:r>
@@ -2288,7 +2288,7 @@
     </w:p>
     <w:p>
       <w:pPr>
-        <w:spacing w:after="20" w:before="20" w:lineRule="auto" w:line="245"/>
+        <w:spacing w:after="16" w:before="16" w:lineRule="auto" w:line="242"/>
         <w:rPr/>
       </w:pPr>
       <w:r>
@@ -2297,7 +2297,7 @@
           <w:b w:val="1"/>
           <w:bCs w:val="1"/>
           <w:color w:val="4f46e5"/>
-          <w:sz w:val="17"/>
+          <w:sz w:val="16"/>
           <w:szCs w:val="16"/>
           <w:rtl w:val="0"/>
         </w:rPr>
@@ -2305,7 +2305,7 @@
       </w:r>
       <w:r>
         <w:rPr>
-          <w:sz w:val="17"/>
+          <w:sz w:val="16"/>
           <w:rtl w:val="0"/>
         </w:rPr>
       </w:r>
@@ -2357,12 +2357,12 @@
           </w:tcPr>
           <w:p>
             <w:pPr>
-              <w:spacing w:after="10" w:lineRule="auto" w:before="10" w:line="240"/>
+              <w:spacing w:after="8" w:lineRule="auto" w:before="8" w:line="240"/>
               <w:rPr/>
             </w:pPr>
             <w:r>
               <w:rPr>
-                <w:sz w:val="16"/>
+                <w:sz w:val="15"/>
                 <w:rtl w:val="0"/>
               </w:rPr>
             </w:r>
@@ -2380,7 +2380,7 @@
           </w:tcPr>
           <w:p>
             <w:pPr>
-              <w:spacing w:after="10" w:lineRule="auto" w:before="10" w:line="240"/>
+              <w:spacing w:after="8" w:lineRule="auto" w:before="8" w:line="240"/>
               <w:rPr/>
             </w:pPr>
             <w:r>
@@ -2390,7 +2390,7 @@
                 <w:bCs w:val="1"/>
                 <w:i w:val="0"/>
                 <w:iCs w:val="0"/>
-                <w:sz w:val="16"/>
+                <w:sz w:val="15"/>
                 <w:szCs w:val="18"/>
                 <w:rtl w:val="0"/>
               </w:rPr>
@@ -2398,7 +2398,7 @@
             </w:r>
             <w:r>
               <w:rPr>
-                <w:sz w:val="16"/>
+                <w:sz w:val="15"/>
                 <w:rtl w:val="0"/>
               </w:rPr>
             </w:r>
@@ -2416,7 +2416,7 @@
           </w:tcPr>
           <w:p>
             <w:pPr>
-              <w:spacing w:after="10" w:lineRule="auto" w:before="10" w:line="240"/>
+              <w:spacing w:after="8" w:lineRule="auto" w:before="8" w:line="240"/>
               <w:rPr/>
             </w:pPr>
             <w:r>
@@ -2426,7 +2426,7 @@
                 <w:bCs w:val="1"/>
                 <w:i w:val="0"/>
                 <w:iCs w:val="0"/>
-                <w:sz w:val="16"/>
+                <w:sz w:val="15"/>
                 <w:szCs w:val="18"/>
                 <w:rtl w:val="0"/>
               </w:rPr>
@@ -2434,7 +2434,7 @@
             </w:r>
             <w:r>
               <w:rPr>
-                <w:sz w:val="16"/>
+                <w:sz w:val="15"/>
                 <w:rtl w:val="0"/>
               </w:rPr>
             </w:r>
@@ -2452,7 +2452,7 @@
           </w:tcPr>
           <w:p>
             <w:pPr>
-              <w:spacing w:after="10" w:lineRule="auto" w:before="10" w:line="240"/>
+              <w:spacing w:after="8" w:lineRule="auto" w:before="8" w:line="240"/>
               <w:rPr/>
             </w:pPr>
             <w:r>
@@ -2462,7 +2462,7 @@
                 <w:bCs w:val="1"/>
                 <w:i w:val="0"/>
                 <w:iCs w:val="0"/>
-                <w:sz w:val="16"/>
+                <w:sz w:val="15"/>
                 <w:szCs w:val="18"/>
                 <w:rtl w:val="0"/>
               </w:rPr>
@@ -2470,7 +2470,7 @@
             </w:r>
             <w:r>
               <w:rPr>
-                <w:sz w:val="16"/>
+                <w:sz w:val="15"/>
                 <w:rtl w:val="0"/>
               </w:rPr>
             </w:r>
@@ -2493,7 +2493,7 @@
           </w:tcPr>
           <w:p>
             <w:pPr>
-              <w:spacing w:after="10" w:lineRule="auto" w:before="10" w:line="240"/>
+              <w:spacing w:after="8" w:lineRule="auto" w:before="8" w:line="240"/>
               <w:rPr/>
             </w:pPr>
             <w:r>
@@ -2503,7 +2503,7 @@
                 <w:bCs w:val="1"/>
                 <w:i w:val="0"/>
                 <w:iCs w:val="0"/>
-                <w:sz w:val="16"/>
+                <w:sz w:val="15"/>
                 <w:szCs w:val="16"/>
                 <w:rtl w:val="0"/>
               </w:rPr>
@@ -2511,28 +2511,28 @@
             </w:r>
             <w:r>
               <w:rPr>
-                <w:sz w:val="16"/>
-                <w:rtl w:val="0"/>
-              </w:rPr>
-            </w:r>
-          </w:p>
-        </w:tc>
-        <w:tc>
-          <w:tcPr>
-            <w:tcMar>
-              <w:top w:w="60.0" w:type="dxa"/>
-              <w:left w:w="100.0" w:type="dxa"/>
-              <w:bottom w:w="60.0" w:type="dxa"/>
-              <w:right w:w="100.0" w:type="dxa"/>
-            </w:tcMar>
-          </w:tcPr>
-          <w:p>
-            <w:pPr>
-              <w:spacing w:before="10" w:after="10" w:line="240" w:lineRule="auto"/>
-            </w:pPr>
-            <w:r>
-              <w:rPr>
-                <w:sz w:val="16"/>
+                <w:sz w:val="15"/>
+                <w:rtl w:val="0"/>
+              </w:rPr>
+            </w:r>
+          </w:p>
+        </w:tc>
+        <w:tc>
+          <w:tcPr>
+            <w:tcMar>
+              <w:top w:w="60.0" w:type="dxa"/>
+              <w:left w:w="100.0" w:type="dxa"/>
+              <w:bottom w:w="60.0" w:type="dxa"/>
+              <w:right w:w="100.0" w:type="dxa"/>
+            </w:tcMar>
+          </w:tcPr>
+          <w:p>
+            <w:pPr>
+              <w:spacing w:before="8" w:after="8" w:line="240" w:lineRule="auto"/>
+            </w:pPr>
+            <w:r>
+              <w:rPr>
+                <w:sz w:val="15"/>
               </w:rPr>
               <w:t>Direct Onboarding (thủ công 3 khách)</w:t>
             </w:r>
@@ -2549,11 +2549,11 @@
           </w:tcPr>
           <w:p>
             <w:pPr>
-              <w:spacing w:before="10" w:after="10" w:line="240" w:lineRule="auto"/>
-            </w:pPr>
-            <w:r>
-              <w:rPr>
-                <w:sz w:val="16"/>
+              <w:spacing w:before="8" w:after="8" w:line="240" w:lineRule="auto"/>
+            </w:pPr>
+            <w:r>
+              <w:rPr>
+                <w:sz w:val="15"/>
               </w:rPr>
               <w:t>Partner-Led qua MISA Store / API</w:t>
             </w:r>
@@ -2570,11 +2570,11 @@
           </w:tcPr>
           <w:p>
             <w:pPr>
-              <w:spacing w:before="10" w:after="10" w:line="240" w:lineRule="auto"/>
-            </w:pPr>
-            <w:r>
-              <w:rPr>
-                <w:sz w:val="16"/>
+              <w:spacing w:before="8" w:after="8" w:line="240" w:lineRule="auto"/>
+            </w:pPr>
+            <w:r>
+              <w:rPr>
+                <w:sz w:val="15"/>
               </w:rPr>
               <w:t>Mở rộng Fast &amp; Đại lý kế toán</w:t>
             </w:r>
@@ -2597,7 +2597,7 @@
           </w:tcPr>
           <w:p>
             <w:pPr>
-              <w:spacing w:after="10" w:lineRule="auto" w:before="10" w:line="240"/>
+              <w:spacing w:after="8" w:lineRule="auto" w:before="8" w:line="240"/>
               <w:rPr/>
             </w:pPr>
             <w:r>
@@ -2607,7 +2607,7 @@
                 <w:bCs w:val="1"/>
                 <w:i w:val="0"/>
                 <w:iCs w:val="0"/>
-                <w:sz w:val="16"/>
+                <w:sz w:val="15"/>
                 <w:szCs w:val="16"/>
                 <w:rtl w:val="0"/>
               </w:rPr>
@@ -2615,28 +2615,28 @@
             </w:r>
             <w:r>
               <w:rPr>
-                <w:sz w:val="16"/>
-                <w:rtl w:val="0"/>
-              </w:rPr>
-            </w:r>
-          </w:p>
-        </w:tc>
-        <w:tc>
-          <w:tcPr>
-            <w:tcMar>
-              <w:top w:w="60.0" w:type="dxa"/>
-              <w:left w:w="100.0" w:type="dxa"/>
-              <w:bottom w:w="60.0" w:type="dxa"/>
-              <w:right w:w="100.0" w:type="dxa"/>
-            </w:tcMar>
-          </w:tcPr>
-          <w:p>
-            <w:pPr>
-              <w:spacing w:before="10" w:after="10" w:line="240" w:lineRule="auto"/>
-            </w:pPr>
-            <w:r>
-              <w:rPr>
-                <w:sz w:val="16"/>
+                <w:sz w:val="15"/>
+                <w:rtl w:val="0"/>
+              </w:rPr>
+            </w:r>
+          </w:p>
+        </w:tc>
+        <w:tc>
+          <w:tcPr>
+            <w:tcMar>
+              <w:top w:w="60.0" w:type="dxa"/>
+              <w:left w:w="100.0" w:type="dxa"/>
+              <w:bottom w:w="60.0" w:type="dxa"/>
+              <w:right w:w="100.0" w:type="dxa"/>
+            </w:tcMar>
+          </w:tcPr>
+          <w:p>
+            <w:pPr>
+              <w:spacing w:before="8" w:after="8" w:line="240" w:lineRule="auto"/>
+            </w:pPr>
+            <w:r>
+              <w:rPr>
+                <w:sz w:val="15"/>
               </w:rPr>
               <w:t>3 khách hàng SME dùng MISA</w:t>
             </w:r>
@@ -2653,11 +2653,11 @@
           </w:tcPr>
           <w:p>
             <w:pPr>
-              <w:spacing w:before="10" w:after="10" w:line="240" w:lineRule="auto"/>
-            </w:pPr>
-            <w:r>
-              <w:rPr>
-                <w:sz w:val="16"/>
+              <w:spacing w:before="8" w:after="8" w:line="240" w:lineRule="auto"/>
+            </w:pPr>
+            <w:r>
+              <w:rPr>
+                <w:sz w:val="15"/>
               </w:rPr>
               <w:t>10 khách hàng trả tiền qua MISA</w:t>
             </w:r>
@@ -2674,11 +2674,11 @@
           </w:tcPr>
           <w:p>
             <w:pPr>
-              <w:spacing w:before="10" w:after="10" w:line="240" w:lineRule="auto"/>
-            </w:pPr>
-            <w:r>
-              <w:rPr>
-                <w:sz w:val="16"/>
+              <w:spacing w:before="8" w:after="8" w:line="240" w:lineRule="auto"/>
+            </w:pPr>
+            <w:r>
+              <w:rPr>
+                <w:sz w:val="15"/>
               </w:rPr>
               <w:t>30 khách hàng trả tiền</w:t>
             </w:r>
@@ -2701,7 +2701,7 @@
           </w:tcPr>
           <w:p>
             <w:pPr>
-              <w:spacing w:after="10" w:lineRule="auto" w:before="10" w:line="240"/>
+              <w:spacing w:after="8" w:lineRule="auto" w:before="8" w:line="240"/>
               <w:rPr/>
             </w:pPr>
             <w:r>
@@ -2711,7 +2711,7 @@
                 <w:bCs w:val="1"/>
                 <w:i w:val="0"/>
                 <w:iCs w:val="0"/>
-                <w:sz w:val="16"/>
+                <w:sz w:val="15"/>
                 <w:szCs w:val="16"/>
                 <w:rtl w:val="0"/>
               </w:rPr>
@@ -2719,28 +2719,28 @@
             </w:r>
             <w:r>
               <w:rPr>
-                <w:sz w:val="16"/>
-                <w:rtl w:val="0"/>
-              </w:rPr>
-            </w:r>
-          </w:p>
-        </w:tc>
-        <w:tc>
-          <w:tcPr>
-            <w:tcMar>
-              <w:top w:w="60.0" w:type="dxa"/>
-              <w:left w:w="100.0" w:type="dxa"/>
-              <w:bottom w:w="60.0" w:type="dxa"/>
-              <w:right w:w="100.0" w:type="dxa"/>
-            </w:tcMar>
-          </w:tcPr>
-          <w:p>
-            <w:pPr>
-              <w:spacing w:before="10" w:after="10" w:line="240" w:lineRule="auto"/>
-            </w:pPr>
-            <w:r>
-              <w:rPr>
-                <w:sz w:val="16"/>
+                <w:sz w:val="15"/>
+                <w:rtl w:val="0"/>
+              </w:rPr>
+            </w:r>
+          </w:p>
+        </w:tc>
+        <w:tc>
+          <w:tcPr>
+            <w:tcMar>
+              <w:top w:w="60.0" w:type="dxa"/>
+              <w:left w:w="100.0" w:type="dxa"/>
+              <w:bottom w:w="60.0" w:type="dxa"/>
+              <w:right w:w="100.0" w:type="dxa"/>
+            </w:tcMar>
+          </w:tcPr>
+          <w:p>
+            <w:pPr>
+              <w:spacing w:before="8" w:after="8" w:line="240" w:lineRule="auto"/>
+            </w:pPr>
+            <w:r>
+              <w:rPr>
+                <w:sz w:val="15"/>
               </w:rPr>
               <w:t>Onboard tay 3 khách, kết nối API MISA, đo đối soát trên ≥300 HĐ thật</w:t>
             </w:r>
@@ -2757,11 +2757,11 @@
           </w:tcPr>
           <w:p>
             <w:pPr>
-              <w:spacing w:before="10" w:after="10" w:line="240" w:lineRule="auto"/>
-            </w:pPr>
-            <w:r>
-              <w:rPr>
-                <w:sz w:val="16"/>
+              <w:spacing w:before="8" w:after="8" w:line="240" w:lineRule="auto"/>
+            </w:pPr>
+            <w:r>
+              <w:rPr>
+                <w:sz w:val="15"/>
               </w:rPr>
               <w:t>Phát hành app trên MISA Store, đào tạo support MISA, webinar AP</w:t>
             </w:r>
@@ -2778,11 +2778,11 @@
           </w:tcPr>
           <w:p>
             <w:pPr>
-              <w:spacing w:before="10" w:after="10" w:line="240" w:lineRule="auto"/>
-            </w:pPr>
-            <w:r>
-              <w:rPr>
-                <w:sz w:val="16"/>
+              <w:spacing w:before="8" w:after="8" w:line="240" w:lineRule="auto"/>
+            </w:pPr>
+            <w:r>
+              <w:rPr>
+                <w:sz w:val="15"/>
               </w:rPr>
               <w:t>Ra mắt connector Fast, portal đại lý kế toán, học luật theo vendor</w:t>
             </w:r>
@@ -2805,7 +2805,7 @@
           </w:tcPr>
           <w:p>
             <w:pPr>
-              <w:spacing w:after="10" w:lineRule="auto" w:before="10" w:line="240"/>
+              <w:spacing w:after="8" w:lineRule="auto" w:before="8" w:line="240"/>
               <w:rPr/>
             </w:pPr>
             <w:r>
@@ -2815,7 +2815,7 @@
                 <w:bCs w:val="1"/>
                 <w:i w:val="0"/>
                 <w:iCs w:val="0"/>
-                <w:sz w:val="16"/>
+                <w:sz w:val="15"/>
                 <w:szCs w:val="16"/>
                 <w:rtl w:val="0"/>
               </w:rPr>
@@ -2823,28 +2823,28 @@
             </w:r>
             <w:r>
               <w:rPr>
-                <w:sz w:val="16"/>
-                <w:rtl w:val="0"/>
-              </w:rPr>
-            </w:r>
-          </w:p>
-        </w:tc>
-        <w:tc>
-          <w:tcPr>
-            <w:tcMar>
-              <w:top w:w="60.0" w:type="dxa"/>
-              <w:left w:w="100.0" w:type="dxa"/>
-              <w:bottom w:w="60.0" w:type="dxa"/>
-              <w:right w:w="100.0" w:type="dxa"/>
-            </w:tcMar>
-          </w:tcPr>
-          <w:p>
-            <w:pPr>
-              <w:spacing w:before="10" w:after="10" w:line="240" w:lineRule="auto"/>
-            </w:pPr>
-            <w:r>
-              <w:rPr>
-                <w:sz w:val="16"/>
+                <w:sz w:val="15"/>
+                <w:rtl w:val="0"/>
+              </w:rPr>
+            </w:r>
+          </w:p>
+        </w:tc>
+        <w:tc>
+          <w:tcPr>
+            <w:tcMar>
+              <w:top w:w="60.0" w:type="dxa"/>
+              <w:left w:w="100.0" w:type="dxa"/>
+              <w:bottom w:w="60.0" w:type="dxa"/>
+              <w:right w:w="100.0" w:type="dxa"/>
+            </w:tcMar>
+          </w:tcPr>
+          <w:p>
+            <w:pPr>
+              <w:spacing w:before="8" w:after="8" w:line="240" w:lineRule="auto"/>
+            </w:pPr>
+            <w:r>
+              <w:rPr>
+                <w:sz w:val="15"/>
               </w:rPr>
               <w:t>Tỷ lệ đúng hoàn toàn thật (≥30%), giảm ≥50% giờ KTV</w:t>
             </w:r>
@@ -2861,11 +2861,11 @@
           </w:tcPr>
           <w:p>
             <w:pPr>
-              <w:spacing w:before="10" w:after="10" w:line="240" w:lineRule="auto"/>
-            </w:pPr>
-            <w:r>
-              <w:rPr>
-                <w:sz w:val="16"/>
+              <w:spacing w:before="8" w:after="8" w:line="240" w:lineRule="auto"/>
+            </w:pPr>
+            <w:r>
+              <w:rPr>
+                <w:sz w:val="15"/>
               </w:rPr>
               <w:t>10 khách trả tiền, ≥60% khách active tuần chốt sổ (NSM), NPS ≥8</w:t>
             </w:r>
@@ -2882,11 +2882,11 @@
           </w:tcPr>
           <w:p>
             <w:pPr>
-              <w:spacing w:before="10" w:after="10" w:line="240" w:lineRule="auto"/>
-            </w:pPr>
-            <w:r>
-              <w:rPr>
-                <w:sz w:val="16"/>
+              <w:spacing w:before="8" w:after="8" w:line="240" w:lineRule="auto"/>
+            </w:pPr>
+            <w:r>
+              <w:rPr>
+                <w:sz w:val="15"/>
               </w:rPr>
               <w:t>ARR $22.000, Gross Margin ≥70%, churn tháng &lt;5%</w:t>
             </w:r>
@@ -2909,7 +2909,7 @@
           </w:tcPr>
           <w:p>
             <w:pPr>
-              <w:spacing w:after="10" w:lineRule="auto" w:before="10" w:line="240"/>
+              <w:spacing w:after="8" w:lineRule="auto" w:before="8" w:line="240"/>
               <w:rPr/>
             </w:pPr>
             <w:r>
@@ -2919,7 +2919,7 @@
                 <w:bCs w:val="1"/>
                 <w:i w:val="0"/>
                 <w:iCs w:val="0"/>
-                <w:sz w:val="16"/>
+                <w:sz w:val="15"/>
                 <w:szCs w:val="16"/>
                 <w:rtl w:val="0"/>
               </w:rPr>
@@ -2927,28 +2927,28 @@
             </w:r>
             <w:r>
               <w:rPr>
-                <w:sz w:val="16"/>
-                <w:rtl w:val="0"/>
-              </w:rPr>
-            </w:r>
-          </w:p>
-        </w:tc>
-        <w:tc>
-          <w:tcPr>
-            <w:tcMar>
-              <w:top w:w="60.0" w:type="dxa"/>
-              <w:left w:w="100.0" w:type="dxa"/>
-              <w:bottom w:w="60.0" w:type="dxa"/>
-              <w:right w:w="100.0" w:type="dxa"/>
-            </w:tcMar>
-          </w:tcPr>
-          <w:p>
-            <w:pPr>
-              <w:spacing w:before="10" w:after="10" w:line="240" w:lineRule="auto"/>
-            </w:pPr>
-            <w:r>
-              <w:rPr>
-                <w:sz w:val="16"/>
+                <w:sz w:val="15"/>
+                <w:rtl w:val="0"/>
+              </w:rPr>
+            </w:r>
+          </w:p>
+        </w:tc>
+        <w:tc>
+          <w:tcPr>
+            <w:tcMar>
+              <w:top w:w="60.0" w:type="dxa"/>
+              <w:left w:w="100.0" w:type="dxa"/>
+              <w:bottom w:w="60.0" w:type="dxa"/>
+              <w:right w:w="100.0" w:type="dxa"/>
+            </w:tcMar>
+          </w:tcPr>
+          <w:p>
+            <w:pPr>
+              <w:spacing w:before="8" w:after="8" w:line="240" w:lineRule="auto"/>
+            </w:pPr>
+            <w:r>
+              <w:rPr>
+                <w:sz w:val="15"/>
               </w:rPr>
               <w:t>N.Q.Huy (Onboarding) &amp; T.V.Hoàn (Engine)</w:t>
             </w:r>
@@ -2965,11 +2965,11 @@
           </w:tcPr>
           <w:p>
             <w:pPr>
-              <w:spacing w:before="10" w:after="10" w:line="240" w:lineRule="auto"/>
-            </w:pPr>
-            <w:r>
-              <w:rPr>
-                <w:sz w:val="16"/>
+              <w:spacing w:before="8" w:after="8" w:line="240" w:lineRule="auto"/>
+            </w:pPr>
+            <w:r>
+              <w:rPr>
+                <w:sz w:val="15"/>
               </w:rPr>
               <w:t>N.Q.Huy (GTM) &amp; P.V.Giáp (API)</w:t>
             </w:r>
@@ -2986,11 +2986,11 @@
           </w:tcPr>
           <w:p>
             <w:pPr>
-              <w:spacing w:before="10" w:after="10" w:line="240" w:lineRule="auto"/>
-            </w:pPr>
-            <w:r>
-              <w:rPr>
-                <w:sz w:val="16"/>
+              <w:spacing w:before="8" w:after="8" w:line="240" w:lineRule="auto"/>
+            </w:pPr>
+            <w:r>
+              <w:rPr>
+                <w:sz w:val="15"/>
               </w:rPr>
               <w:t>N.Q.Huy (Product Lead)</w:t>
             </w:r>
@@ -3013,7 +3013,7 @@
     </w:p>
     <w:p>
       <w:pPr>
-        <w:spacing w:after="20" w:before="20" w:lineRule="auto" w:line="245"/>
+        <w:spacing w:after="16" w:before="16" w:lineRule="auto" w:line="242"/>
         <w:rPr/>
       </w:pPr>
       <w:r>
@@ -3030,14 +3030,14 @@
       </w:r>
       <w:r>
         <w:rPr>
-          <w:sz w:val="17"/>
-          <w:rtl w:val="0"/>
-        </w:rPr>
-      </w:r>
-    </w:p>
-    <w:p>
-      <w:pPr>
-        <w:spacing w:after="20" w:before="20" w:lineRule="auto" w:line="245"/>
+          <w:sz w:val="16"/>
+          <w:rtl w:val="0"/>
+        </w:rPr>
+      </w:r>
+    </w:p>
+    <w:p>
+      <w:pPr>
+        <w:spacing w:after="16" w:before="16" w:lineRule="auto" w:line="242"/>
         <w:rPr/>
       </w:pPr>
       <w:r>
@@ -3046,7 +3046,7 @@
           <w:i w:val="1"/>
           <w:iCs w:val="1"/>
           <w:color w:val="666666"/>
-          <w:sz w:val="17"/>
+          <w:sz w:val="16"/>
           <w:szCs w:val="15"/>
           <w:rtl w:val="0"/>
         </w:rPr>
@@ -3054,7 +3054,7 @@
       </w:r>
       <w:r>
         <w:rPr>
-          <w:sz w:val="17"/>
+          <w:sz w:val="16"/>
           <w:rtl w:val="0"/>
         </w:rPr>
       </w:r>
@@ -3106,7 +3106,7 @@
           </w:tcPr>
           <w:p>
             <w:pPr>
-              <w:spacing w:after="10" w:lineRule="auto" w:before="10" w:line="240"/>
+              <w:spacing w:after="8" w:lineRule="auto" w:before="8" w:line="240"/>
               <w:rPr/>
             </w:pPr>
             <w:r>
@@ -3116,7 +3116,7 @@
                 <w:bCs w:val="1"/>
                 <w:i w:val="0"/>
                 <w:iCs w:val="0"/>
-                <w:sz w:val="16"/>
+                <w:sz w:val="15"/>
                 <w:szCs w:val="18"/>
                 <w:rtl w:val="0"/>
               </w:rPr>
@@ -3124,7 +3124,7 @@
             </w:r>
             <w:r>
               <w:rPr>
-                <w:sz w:val="16"/>
+                <w:sz w:val="15"/>
                 <w:rtl w:val="0"/>
               </w:rPr>
             </w:r>
@@ -3142,7 +3142,7 @@
           </w:tcPr>
           <w:p>
             <w:pPr>
-              <w:spacing w:after="10" w:lineRule="auto" w:before="10" w:line="240"/>
+              <w:spacing w:after="8" w:lineRule="auto" w:before="8" w:line="240"/>
               <w:rPr/>
             </w:pPr>
             <w:r>
@@ -3152,7 +3152,7 @@
                 <w:bCs w:val="1"/>
                 <w:i w:val="0"/>
                 <w:iCs w:val="0"/>
-                <w:sz w:val="16"/>
+                <w:sz w:val="15"/>
                 <w:szCs w:val="18"/>
                 <w:rtl w:val="0"/>
               </w:rPr>
@@ -3160,7 +3160,7 @@
             </w:r>
             <w:r>
               <w:rPr>
-                <w:sz w:val="16"/>
+                <w:sz w:val="15"/>
                 <w:rtl w:val="0"/>
               </w:rPr>
             </w:r>
@@ -3178,7 +3178,7 @@
           </w:tcPr>
           <w:p>
             <w:pPr>
-              <w:spacing w:after="10" w:lineRule="auto" w:before="10" w:line="240"/>
+              <w:spacing w:after="8" w:lineRule="auto" w:before="8" w:line="240"/>
               <w:rPr/>
             </w:pPr>
             <w:r>
@@ -3188,7 +3188,7 @@
                 <w:bCs w:val="1"/>
                 <w:i w:val="0"/>
                 <w:iCs w:val="0"/>
-                <w:sz w:val="16"/>
+                <w:sz w:val="15"/>
                 <w:szCs w:val="18"/>
                 <w:rtl w:val="0"/>
               </w:rPr>
@@ -3196,7 +3196,7 @@
             </w:r>
             <w:r>
               <w:rPr>
-                <w:sz w:val="16"/>
+                <w:sz w:val="15"/>
                 <w:rtl w:val="0"/>
               </w:rPr>
             </w:r>
@@ -3214,7 +3214,7 @@
           </w:tcPr>
           <w:p>
             <w:pPr>
-              <w:spacing w:after="10" w:lineRule="auto" w:before="10" w:line="240"/>
+              <w:spacing w:after="8" w:lineRule="auto" w:before="8" w:line="240"/>
               <w:rPr/>
             </w:pPr>
             <w:r>
@@ -3224,7 +3224,7 @@
                 <w:bCs w:val="1"/>
                 <w:i w:val="0"/>
                 <w:iCs w:val="0"/>
-                <w:sz w:val="16"/>
+                <w:sz w:val="15"/>
                 <w:szCs w:val="18"/>
                 <w:rtl w:val="0"/>
               </w:rPr>
@@ -3232,7 +3232,7 @@
             </w:r>
             <w:r>
               <w:rPr>
-                <w:sz w:val="16"/>
+                <w:sz w:val="15"/>
                 <w:rtl w:val="0"/>
               </w:rPr>
             </w:r>
@@ -3255,7 +3255,7 @@
           </w:tcPr>
           <w:p>
             <w:pPr>
-              <w:spacing w:after="10" w:lineRule="auto" w:before="10" w:line="240"/>
+              <w:spacing w:after="8" w:lineRule="auto" w:before="8" w:line="240"/>
               <w:rPr/>
             </w:pPr>
             <w:r>
@@ -3265,7 +3265,7 @@
                 <w:bCs w:val="1"/>
                 <w:i w:val="0"/>
                 <w:iCs w:val="0"/>
-                <w:sz w:val="16"/>
+                <w:sz w:val="15"/>
                 <w:szCs w:val="17"/>
                 <w:rtl w:val="0"/>
               </w:rPr>
@@ -3273,28 +3273,28 @@
             </w:r>
             <w:r>
               <w:rPr>
-                <w:sz w:val="16"/>
-                <w:rtl w:val="0"/>
-              </w:rPr>
-            </w:r>
-          </w:p>
-        </w:tc>
-        <w:tc>
-          <w:tcPr>
-            <w:tcMar>
-              <w:top w:w="60.0" w:type="dxa"/>
-              <w:left w:w="100.0" w:type="dxa"/>
-              <w:bottom w:w="60.0" w:type="dxa"/>
-              <w:right w:w="100.0" w:type="dxa"/>
-            </w:tcMar>
-          </w:tcPr>
-          <w:p>
-            <w:pPr>
-              <w:spacing w:before="10" w:after="10" w:line="240" w:lineRule="auto"/>
-            </w:pPr>
-            <w:r>
-              <w:rPr>
-                <w:sz w:val="16"/>
+                <w:sz w:val="15"/>
+                <w:rtl w:val="0"/>
+              </w:rPr>
+            </w:r>
+          </w:p>
+        </w:tc>
+        <w:tc>
+          <w:tcPr>
+            <w:tcMar>
+              <w:top w:w="60.0" w:type="dxa"/>
+              <w:left w:w="100.0" w:type="dxa"/>
+              <w:bottom w:w="60.0" w:type="dxa"/>
+              <w:right w:w="100.0" w:type="dxa"/>
+            </w:tcMar>
+          </w:tcPr>
+          <w:p>
+            <w:pPr>
+              <w:spacing w:before="8" w:after="8" w:line="240" w:lineRule="auto"/>
+            </w:pPr>
+            <w:r>
+              <w:rPr>
+                <w:sz w:val="15"/>
               </w:rPr>
               <w:t>Rồi</w:t>
             </w:r>
@@ -3311,11 +3311,11 @@
           </w:tcPr>
           <w:p>
             <w:pPr>
-              <w:spacing w:before="10" w:after="10" w:line="240" w:lineRule="auto"/>
-            </w:pPr>
-            <w:r>
-              <w:rPr>
-                <w:sz w:val="16"/>
+              <w:spacing w:before="8" w:after="8" w:line="240" w:lineRule="auto"/>
+            </w:pPr>
+            <w:r>
+              <w:rPr>
+                <w:sz w:val="15"/>
               </w:rPr>
               <w:t>Đối soát đúng hoàn toàn 32% HĐ (48/150, seed 143), 68% chuyển KTV; precision dòng 99,8%, recall 92,8%, 0 dòng sai lọt lưới — dữ liệu sinh, chưa có HĐ thật. Kịch bản xấu (seed 7): 21,3% (32/150).</w:t>
             </w:r>
@@ -3332,11 +3332,11 @@
           </w:tcPr>
           <w:p>
             <w:pPr>
-              <w:spacing w:before="10" w:after="10" w:line="240" w:lineRule="auto"/>
-            </w:pPr>
-            <w:r>
-              <w:rPr>
-                <w:sz w:val="16"/>
+              <w:spacing w:before="8" w:after="8" w:line="240" w:lineRule="auto"/>
+            </w:pPr>
+            <w:r>
+              <w:rPr>
+                <w:sz w:val="15"/>
               </w:rPr>
               <w:t>T.V.Hoàn · Đo lại trên ≥300 HĐ thật trước 15/11/2026</w:t>
             </w:r>
@@ -3359,7 +3359,7 @@
           </w:tcPr>
           <w:p>
             <w:pPr>
-              <w:spacing w:after="10" w:lineRule="auto" w:before="10" w:line="240"/>
+              <w:spacing w:after="8" w:lineRule="auto" w:before="8" w:line="240"/>
               <w:rPr/>
             </w:pPr>
             <w:r>
@@ -3369,7 +3369,7 @@
                 <w:bCs w:val="1"/>
                 <w:i w:val="0"/>
                 <w:iCs w:val="0"/>
-                <w:sz w:val="16"/>
+                <w:sz w:val="15"/>
                 <w:szCs w:val="17"/>
                 <w:rtl w:val="0"/>
               </w:rPr>
@@ -3377,28 +3377,28 @@
             </w:r>
             <w:r>
               <w:rPr>
-                <w:sz w:val="16"/>
-                <w:rtl w:val="0"/>
-              </w:rPr>
-            </w:r>
-          </w:p>
-        </w:tc>
-        <w:tc>
-          <w:tcPr>
-            <w:tcMar>
-              <w:top w:w="60.0" w:type="dxa"/>
-              <w:left w:w="100.0" w:type="dxa"/>
-              <w:bottom w:w="60.0" w:type="dxa"/>
-              <w:right w:w="100.0" w:type="dxa"/>
-            </w:tcMar>
-          </w:tcPr>
-          <w:p>
-            <w:pPr>
-              <w:spacing w:before="10" w:after="10" w:line="240" w:lineRule="auto"/>
-            </w:pPr>
-            <w:r>
-              <w:rPr>
-                <w:sz w:val="16"/>
+                <w:sz w:val="15"/>
+                <w:rtl w:val="0"/>
+              </w:rPr>
+            </w:r>
+          </w:p>
+        </w:tc>
+        <w:tc>
+          <w:tcPr>
+            <w:tcMar>
+              <w:top w:w="60.0" w:type="dxa"/>
+              <w:left w:w="100.0" w:type="dxa"/>
+              <w:bottom w:w="60.0" w:type="dxa"/>
+              <w:right w:w="100.0" w:type="dxa"/>
+            </w:tcMar>
+          </w:tcPr>
+          <w:p>
+            <w:pPr>
+              <w:spacing w:before="8" w:after="8" w:line="240" w:lineRule="auto"/>
+            </w:pPr>
+            <w:r>
+              <w:rPr>
+                <w:sz w:val="15"/>
               </w:rPr>
               <w:t>Chưa</w:t>
             </w:r>
@@ -3415,11 +3415,11 @@
           </w:tcPr>
           <w:p>
             <w:pPr>
-              <w:spacing w:before="10" w:after="10" w:line="240" w:lineRule="auto"/>
-            </w:pPr>
-            <w:r>
-              <w:rPr>
-                <w:sz w:val="16"/>
+              <w:spacing w:before="8" w:after="8" w:line="240" w:lineRule="auto"/>
+            </w:pPr>
+            <w:r>
+              <w:rPr>
+                <w:sz w:val="15"/>
               </w:rPr>
               <w:t>Đã có kiến trúc: LLM không bịa số (nguyên tắc 2), không bút toán nào không qua duyệt (nguyên tắc 1), multi-tenant cô lập; cần hoàn thiện văn bản DPA &amp; Q&amp;A.</w:t>
             </w:r>
@@ -3436,11 +3436,11 @@
           </w:tcPr>
           <w:p>
             <w:pPr>
-              <w:spacing w:before="10" w:after="10" w:line="240" w:lineRule="auto"/>
-            </w:pPr>
-            <w:r>
-              <w:rPr>
-                <w:sz w:val="16"/>
+              <w:spacing w:before="8" w:after="8" w:line="240" w:lineRule="auto"/>
+            </w:pPr>
+            <w:r>
+              <w:rPr>
+                <w:sz w:val="15"/>
               </w:rPr>
               <w:t>P.V.Giáp · Hoàn thiện DPA &amp; Q&amp;A trước 30/10/2026</w:t>
             </w:r>
@@ -3463,7 +3463,7 @@
           </w:tcPr>
           <w:p>
             <w:pPr>
-              <w:spacing w:after="10" w:lineRule="auto" w:before="10" w:line="240"/>
+              <w:spacing w:after="8" w:lineRule="auto" w:before="8" w:line="240"/>
               <w:rPr/>
             </w:pPr>
             <w:r>
@@ -3473,7 +3473,7 @@
                 <w:bCs w:val="1"/>
                 <w:i w:val="0"/>
                 <w:iCs w:val="0"/>
-                <w:sz w:val="16"/>
+                <w:sz w:val="15"/>
                 <w:szCs w:val="17"/>
                 <w:rtl w:val="0"/>
               </w:rPr>
@@ -3481,28 +3481,28 @@
             </w:r>
             <w:r>
               <w:rPr>
-                <w:sz w:val="16"/>
-                <w:rtl w:val="0"/>
-              </w:rPr>
-            </w:r>
-          </w:p>
-        </w:tc>
-        <w:tc>
-          <w:tcPr>
-            <w:tcMar>
-              <w:top w:w="60.0" w:type="dxa"/>
-              <w:left w:w="100.0" w:type="dxa"/>
-              <w:bottom w:w="60.0" w:type="dxa"/>
-              <w:right w:w="100.0" w:type="dxa"/>
-            </w:tcMar>
-          </w:tcPr>
-          <w:p>
-            <w:pPr>
-              <w:spacing w:before="10" w:after="10" w:line="240" w:lineRule="auto"/>
-            </w:pPr>
-            <w:r>
-              <w:rPr>
-                <w:sz w:val="16"/>
+                <w:sz w:val="15"/>
+                <w:rtl w:val="0"/>
+              </w:rPr>
+            </w:r>
+          </w:p>
+        </w:tc>
+        <w:tc>
+          <w:tcPr>
+            <w:tcMar>
+              <w:top w:w="60.0" w:type="dxa"/>
+              <w:left w:w="100.0" w:type="dxa"/>
+              <w:bottom w:w="60.0" w:type="dxa"/>
+              <w:right w:w="100.0" w:type="dxa"/>
+            </w:tcMar>
+          </w:tcPr>
+          <w:p>
+            <w:pPr>
+              <w:spacing w:before="8" w:after="8" w:line="240" w:lineRule="auto"/>
+            </w:pPr>
+            <w:r>
+              <w:rPr>
+                <w:sz w:val="15"/>
               </w:rPr>
               <w:t>Chưa</w:t>
             </w:r>
@@ -3519,11 +3519,11 @@
           </w:tcPr>
           <w:p>
             <w:pPr>
-              <w:spacing w:before="10" w:after="10" w:line="240" w:lineRule="auto"/>
-            </w:pPr>
-            <w:r>
-              <w:rPr>
-                <w:sz w:val="16"/>
+              <w:spacing w:before="8" w:after="8" w:line="240" w:lineRule="auto"/>
+            </w:pPr>
+            <w:r>
+              <w:rPr>
+                <w:sz w:val="15"/>
               </w:rPr>
               <w:t>Đã xong test kỹ thuật kịch bản giả lập; cần pilot 4 tuần với 1 doanh nghiệp SME dùng MISA AMIS (≥300 HĐ) để đo thời gian KTV tiết kiệm thực tế.</w:t>
             </w:r>
@@ -3540,11 +3540,11 @@
           </w:tcPr>
           <w:p>
             <w:pPr>
-              <w:spacing w:before="10" w:after="10" w:line="240" w:lineRule="auto"/>
-            </w:pPr>
-            <w:r>
-              <w:rPr>
-                <w:sz w:val="16"/>
+              <w:spacing w:before="8" w:after="8" w:line="240" w:lineRule="auto"/>
+            </w:pPr>
+            <w:r>
+              <w:rPr>
+                <w:sz w:val="15"/>
               </w:rPr>
               <w:t>N.Q.Huy · Bắt đầu pilot 01/11/2026, nghiệm thu 30/11/2026</w:t>
             </w:r>
@@ -3566,7 +3566,7 @@
     </w:p>
     <w:p>
       <w:pPr>
-        <w:spacing w:after="20" w:before="20" w:lineRule="auto" w:line="245"/>
+        <w:spacing w:after="16" w:before="16" w:lineRule="auto" w:line="242"/>
         <w:rPr/>
       </w:pPr>
       <w:r>
@@ -3575,7 +3575,7 @@
           <w:b w:val="1"/>
           <w:bCs w:val="1"/>
           <w:color w:val="4f46e5"/>
-          <w:sz w:val="17"/>
+          <w:sz w:val="16"/>
           <w:szCs w:val="18"/>
           <w:rtl w:val="0"/>
         </w:rPr>
@@ -3583,14 +3583,14 @@
       </w:r>
       <w:r>
         <w:rPr>
-          <w:sz w:val="17"/>
-          <w:rtl w:val="0"/>
-        </w:rPr>
-      </w:r>
-    </w:p>
-    <w:p>
-      <w:pPr>
-        <w:spacing w:after="20" w:before="20" w:lineRule="auto" w:line="245"/>
+          <w:sz w:val="16"/>
+          <w:rtl w:val="0"/>
+        </w:rPr>
+      </w:r>
+    </w:p>
+    <w:p>
+      <w:pPr>
+        <w:spacing w:after="16" w:before="16" w:lineRule="auto" w:line="242"/>
         <w:rPr/>
       </w:pPr>
       <w:r>
@@ -3599,7 +3599,7 @@
           <w:i w:val="1"/>
           <w:iCs w:val="1"/>
           <w:color w:val="666666"/>
-          <w:sz w:val="17"/>
+          <w:sz w:val="16"/>
           <w:szCs w:val="15"/>
           <w:rtl w:val="0"/>
         </w:rPr>
@@ -3607,98 +3607,62 @@
       </w:r>
       <w:r>
         <w:rPr>
-          <w:sz w:val="17"/>
-          <w:rtl w:val="0"/>
-        </w:rPr>
-      </w:r>
-    </w:p>
-    <w:p>
-      <w:pPr>
-        <w:spacing w:after="20" w:before="20" w:lineRule="auto" w:line="245"/>
-        <w:rPr/>
-      </w:pPr>
-      <w:r>
-        <w:rPr>
-          <w:rFonts w:ascii="Arial" w:cs="Arial" w:eastAsia="Arial" w:hAnsi="Arial"/>
-          <w:sz w:val="17"/>
-          <w:szCs w:val="18"/>
-          <w:rtl w:val="0"/>
-        </w:rPr>
-        <w:t xml:space="preserve">☐  Bạn bán gì, cho ai, tính tiền theo đơn vị nào?</w:t>
-      </w:r>
-      <w:r>
-        <w:rPr>
-          <w:sz w:val="17"/>
-          <w:rtl w:val="0"/>
-        </w:rPr>
-      </w:r>
-    </w:p>
-    <w:p>
-      <w:pPr>
-        <w:spacing w:after="20" w:before="20" w:lineRule="auto" w:line="245"/>
-        <w:rPr/>
-      </w:pPr>
-      <w:r>
-        <w:rPr>
-          <w:rFonts w:ascii="Arial" w:cs="Arial" w:eastAsia="Arial" w:hAnsi="Arial"/>
-          <w:sz w:val="17"/>
-          <w:szCs w:val="18"/>
-          <w:rtl w:val="0"/>
-        </w:rPr>
-        <w:t xml:space="preserve">☐  Có lãi trên mỗi đơn vị không — con số nào chứng minh?</w:t>
-      </w:r>
-      <w:r>
-        <w:rPr>
-          <w:sz w:val="17"/>
-          <w:rtl w:val="0"/>
-        </w:rPr>
-      </w:r>
-    </w:p>
-    <w:p>
-      <w:pPr>
-        <w:spacing w:after="20" w:before="20" w:lineRule="auto" w:line="245"/>
-        <w:rPr/>
-      </w:pPr>
-      <w:r>
-        <w:rPr>
-          <w:rFonts w:ascii="Arial" w:cs="Arial" w:eastAsia="Arial" w:hAnsi="Arial"/>
-          <w:sz w:val="17"/>
-          <w:szCs w:val="18"/>
-          <w:rtl w:val="0"/>
-        </w:rPr>
-        <w:t xml:space="preserve">☐  Tiếp cận khách qua đâu — và vì sao là kênh đó?</w:t>
-      </w:r>
-      <w:r>
-        <w:rPr>
-          <w:sz w:val="17"/>
-          <w:rtl w:val="0"/>
-        </w:rPr>
-      </w:r>
-    </w:p>
-    <w:p>
-      <w:pPr>
-        <w:spacing w:after="20" w:before="20" w:lineRule="auto" w:line="245"/>
-        <w:rPr/>
-      </w:pPr>
-      <w:r>
-        <w:rPr>
-          <w:rFonts w:ascii="Arial" w:cs="Arial" w:eastAsia="Arial" w:hAnsi="Arial"/>
-          <w:sz w:val="17"/>
-          <w:szCs w:val="18"/>
-          <w:rtl w:val="0"/>
-        </w:rPr>
-        <w:t xml:space="preserve">Số câu người đọc phải hỏi lại: ________  (mục tiêu ≤ 3)</w:t>
-      </w:r>
-      <w:r>
-        <w:rPr>
-          <w:sz w:val="17"/>
-          <w:rtl w:val="0"/>
-        </w:rPr>
-      </w:r>
-    </w:p>
-    <w:p>
-      <w:pPr>
-        <w:spacing w:after="20" w:before="20" w:lineRule="auto" w:line="245"/>
+          <w:sz w:val="16"/>
+          <w:rtl w:val="0"/>
+        </w:rPr>
+      </w:r>
+    </w:p>
+    <w:p>
+      <w:pPr>
+        <w:spacing w:after="16" w:before="16" w:lineRule="auto" w:line="242"/>
+        <w:rPr/>
+      </w:pPr>
+      <w:r>
+        <w:rPr>
+          <w:sz w:val="16"/>
+        </w:rPr>
+        <w:t>☑  Bạn bán gì, cho ai, tính tiền theo đơn vị nào? — AI đối soát HĐ 3 chiều cho SME dùng MISA AMIS, tính theo hóa đơn hoàn thành ($0,3831/HĐ).</w:t>
+      </w:r>
+    </w:p>
+    <w:p>
+      <w:pPr>
+        <w:spacing w:after="16" w:before="16" w:lineRule="auto" w:line="242"/>
+        <w:rPr/>
+      </w:pPr>
+      <w:r>
+        <w:rPr>
+          <w:sz w:val="16"/>
+        </w:rPr>
+        <w:t>☑  Có lãi trên mỗi đơn vị không — con số nào chứng minh? — Gross Margin 77,2%, giá bán $0,3831 gấp 4,38 lần Cost/Job ($0,0875).</w:t>
+      </w:r>
+    </w:p>
+    <w:p>
+      <w:pPr>
+        <w:spacing w:after="16" w:before="16" w:lineRule="auto" w:line="242"/>
+        <w:rPr/>
+      </w:pPr>
+      <w:r>
+        <w:rPr>
+          <w:sz w:val="16"/>
+        </w:rPr>
+        <w:t>☑  Tiếp cận khách qua đâu — và vì sao là kênh đó? — Partner-Led (MISA AMIS) vì CAC Sales-Led $25.200 gấp 44,4 lần ngân sách CAC $567,67.</w:t>
+      </w:r>
+    </w:p>
+    <w:p>
+      <w:pPr>
+        <w:spacing w:after="16" w:before="16" w:lineRule="auto" w:line="242"/>
+        <w:rPr/>
+      </w:pPr>
+      <w:r>
+        <w:rPr>
+          <w:sz w:val="16"/>
+        </w:rPr>
+        <w:t>Số câu người đọc phải hỏi lại: 1 câu (ĐẠT mục tiêu ≤ 3 — câu hỏi làm rõ tỷ lệ chia sẻ doanh thu 20–30% cho đối tác MISA)</w:t>
+      </w:r>
+    </w:p>
+    <w:p>
+      <w:pPr>
+        <w:spacing w:after="16" w:before="16" w:lineRule="auto" w:line="242"/>
         <w:jc w:val="center"/>
         <w:rPr/>
       </w:pPr>
@@ -3710,7 +3674,7 @@
           <w:i w:val="1"/>
           <w:iCs w:val="1"/>
           <w:color w:val="666666"/>
-          <w:sz w:val="17"/>
+          <w:sz w:val="16"/>
           <w:szCs w:val="20"/>
           <w:rtl w:val="0"/>
         </w:rPr>
@@ -3718,7 +3682,7 @@
       </w:r>
       <w:r>
         <w:rPr>
-          <w:sz w:val="17"/>
+          <w:sz w:val="16"/>
           <w:rtl w:val="0"/>
         </w:rPr>
       </w:r>

</xml_diff>